<commit_message>
Update Holambra - Plano DNS rev2 (guia detalhado DNSSEC, FAQ, checklist e imagem do painel)
</commit_message>
<xml_diff>
--- a/Holambra/Plano_Migracao_DNS_Holambra_Azure.docx
+++ b/Holambra/Plano_Migracao_DNS_Holambra_Azure.docx
@@ -7,9 +7,6 @@
         <w:jc w:val="center"/>
       </w:pPr>
       <w:r>
-        <w:rPr>
-          <w:sz w:val="22"/>
-        </w:rPr>
         <w:br/>
         <w:br/>
         <w:br/>
@@ -25,7 +22,7 @@
           <w:color w:val="003366"/>
           <w:sz w:val="44"/>
         </w:rPr>
-        <w:t>PLANO DE MIGRAÇÃO DNS</w:t>
+        <w:t>PLANO DE MIGRACAO DNS</w:t>
       </w:r>
     </w:p>
     <w:p>
@@ -50,7 +47,7 @@
           <w:color w:val="505050"/>
           <w:sz w:val="28"/>
         </w:rPr>
-        <w:t>Registro.br → Azure DNS</w:t>
+        <w:t>Registro.br -&gt; Azure DNS</w:t>
       </w:r>
     </w:p>
     <w:p>
@@ -78,6 +75,19 @@
       </w:r>
     </w:p>
     <w:p>
+      <w:pPr>
+        <w:jc w:val="center"/>
+      </w:pPr>
+      <w:r>
+        <w:rPr>
+          <w:i/>
+          <w:color w:val="787878"/>
+          <w:sz w:val="20"/>
+        </w:rPr>
+        <w:t>Revisao 2 - inclui guia detalhado de DNSSEC e FAQ</w:t>
+      </w:r>
+    </w:p>
+    <w:p>
       <w:r>
         <w:br w:type="page"/>
       </w:r>
@@ -87,7 +97,7 @@
         <w:pStyle w:val="Heading1"/>
       </w:pPr>
       <w:r>
-        <w:t>Sumário</w:t>
+        <w:t>Sumario</w:t>
       </w:r>
     </w:p>
     <w:p>
@@ -95,7 +105,7 @@
         <w:spacing w:after="40" w:before="40"/>
       </w:pPr>
       <w:r>
-        <w:t>1. Análise Atual do Domínio</w:t>
+        <w:t>1. Analise Atual do Dominio</w:t>
       </w:r>
     </w:p>
     <w:p>
@@ -103,7 +113,7 @@
         <w:spacing w:after="40" w:before="40"/>
       </w:pPr>
       <w:r>
-        <w:t xml:space="preserve">   1.1. Nameservers</w:t>
+        <w:t>2. FASE 1 - Desabilitar DNSSEC no Registro.br</w:t>
       </w:r>
     </w:p>
     <w:p>
@@ -111,7 +121,7 @@
         <w:spacing w:after="40" w:before="40"/>
       </w:pPr>
       <w:r>
-        <w:t xml:space="preserve">   1.2. DNSSEC</w:t>
+        <w:t>3. FASE 2 - Criar a Zona DNS no Azure</w:t>
       </w:r>
     </w:p>
     <w:p>
@@ -119,7 +129,7 @@
         <w:spacing w:after="40" w:before="40"/>
       </w:pPr>
       <w:r>
-        <w:t xml:space="preserve">   1.3. Registros DNS Existentes</w:t>
+        <w:t>4. FASE 3 - Apontar os Nameservers no Registro.br</w:t>
       </w:r>
     </w:p>
     <w:p>
@@ -127,39 +137,7 @@
         <w:spacing w:after="40" w:before="40"/>
       </w:pPr>
       <w:r>
-        <w:t xml:space="preserve">   1.4. Observações Importantes</w:t>
-      </w:r>
-    </w:p>
-    <w:p>
-      <w:pPr>
-        <w:spacing w:after="40" w:before="40"/>
-      </w:pPr>
-      <w:r>
-        <w:t>2. FASE 1 – Desabilitar DNSSEC no Registro.br</w:t>
-      </w:r>
-    </w:p>
-    <w:p>
-      <w:pPr>
-        <w:spacing w:after="40" w:before="40"/>
-      </w:pPr>
-      <w:r>
-        <w:t>3. FASE 2 – Criar a Zona DNS no Azure</w:t>
-      </w:r>
-    </w:p>
-    <w:p>
-      <w:pPr>
-        <w:spacing w:after="40" w:before="40"/>
-      </w:pPr>
-      <w:r>
-        <w:t>4. FASE 3 – Apontar os Nameservers no Registro.br</w:t>
-      </w:r>
-    </w:p>
-    <w:p>
-      <w:pPr>
-        <w:spacing w:after="40" w:before="40"/>
-      </w:pPr>
-      <w:r>
-        <w:t>5. FASE 4 – Reabilitar DNSSEC no Azure DNS</w:t>
+        <w:t>5. FASE 4 - Reabilitar DNSSEC no Azure DNS</w:t>
       </w:r>
     </w:p>
     <w:p>
@@ -175,7 +153,31 @@
         <w:spacing w:after="40" w:before="40"/>
       </w:pPr>
       <w:r>
-        <w:t>7. Riscos e Mitigações</w:t>
+        <w:t>7. Riscos e Mitigacoes</w:t>
+      </w:r>
+    </w:p>
+    <w:p>
+      <w:pPr>
+        <w:spacing w:after="40" w:before="40"/>
+      </w:pPr>
+      <w:r>
+        <w:t>ANEXO A - Guia Detalhado: Como Desabilitar o DNSSEC no Registro.br</w:t>
+      </w:r>
+    </w:p>
+    <w:p>
+      <w:pPr>
+        <w:spacing w:after="40" w:before="40"/>
+      </w:pPr>
+      <w:r>
+        <w:t>ANEXO B - FAQ para o Cliente</w:t>
+      </w:r>
+    </w:p>
+    <w:p>
+      <w:pPr>
+        <w:spacing w:after="40" w:before="40"/>
+      </w:pPr>
+      <w:r>
+        <w:t>ANEXO C - Checklist de Preparacao</w:t>
       </w:r>
     </w:p>
     <w:p>
@@ -188,7 +190,7 @@
         <w:pStyle w:val="Heading1"/>
       </w:pPr>
       <w:r>
-        <w:t>1. Análise Atual do Domínio</w:t>
+        <w:t>1. Analise Atual do Dominio</w:t>
       </w:r>
     </w:p>
     <w:p>
@@ -224,11 +226,23 @@
       </w:r>
     </w:p>
     <w:p>
+      <w:r>
+        <w:rPr>
+          <w:b/>
+          <w:color w:val="006600"/>
+        </w:rPr>
+        <w:t xml:space="preserve">IMPORTANTE: </w:t>
+      </w:r>
+      <w:r>
+        <w:t>Os nameservers atuais sao do proprio Registro.br (servico de DNS hospedado). Isso significa que o Registro.br hospeda a zona E gerencia o DNSSEC automaticamente. Na pratica, desabilitar o DNSSEC sera apenas desligar um botao (toggle), e o Registro.br remove o DS e des-assina a zona na ordem correta automaticamente. Veja o ANEXO A.</w:t>
+      </w:r>
+    </w:p>
+    <w:p>
       <w:pPr>
         <w:pStyle w:val="Heading2"/>
       </w:pPr>
       <w:r>
-        <w:t>1.2. DNSSEC – ATIVO (confirmado)</w:t>
+        <w:t>1.2. DNSSEC - ATIVO (confirmado)</w:t>
       </w:r>
     </w:p>
     <w:tbl>
@@ -347,7 +361,7 @@
           </w:tcPr>
           <w:p>
             <w:r>
-              <w:t>true (validação DNSSEC passando corretamente)</w:t>
+              <w:t>true (validacao DNSSEC passando corretamente)</w:t>
             </w:r>
           </w:p>
         </w:tc>
@@ -380,7 +394,7 @@
         <w:pStyle w:val="Heading2"/>
       </w:pPr>
       <w:r>
-        <w:t>1.3. Registros DNS Existentes (inventário completo)</w:t>
+        <w:t>1.3. Registros DNS Existentes (inventario completo)</w:t>
       </w:r>
     </w:p>
     <w:tbl>
@@ -722,7 +736,7 @@
         <w:rPr>
           <w:b/>
         </w:rPr>
-        <w:t>Registros NÃO encontrados (não precisam ser migrados):</w:t>
+        <w:t>Registros NAO encontrados (nao precisam ser migrados):</w:t>
       </w:r>
     </w:p>
     <w:p>
@@ -738,7 +752,7 @@
         <w:pStyle w:val="ListBullet"/>
       </w:pPr>
       <w:r>
-        <w:t>selector2._domainkey (inexistente – apenas selector1 configurado)</w:t>
+        <w:t>selector2._domainkey (inexistente - apenas selector1 configurado)</w:t>
       </w:r>
     </w:p>
     <w:p>
@@ -762,7 +776,7 @@
         <w:pStyle w:val="Heading2"/>
       </w:pPr>
       <w:r>
-        <w:t>1.4. Observações Importantes</w:t>
+        <w:t>1.4. Observacoes Importantes</w:t>
       </w:r>
     </w:p>
     <w:p>
@@ -770,7 +784,7 @@
         <w:pStyle w:val="ListBullet"/>
       </w:pPr>
       <w:r>
-        <w:t>O IP 191.232.160.136 já pertence ao range do Azure – o site já está hospedado lá.</w:t>
+        <w:t>O IP 191.232.160.136 ja pertence ao range do Azure - o site ja esta hospedado la.</w:t>
       </w:r>
     </w:p>
     <w:p>
@@ -778,7 +792,7 @@
         <w:pStyle w:val="ListBullet"/>
       </w:pPr>
       <w:r>
-        <w:t>Forte integração com Microsoft 365 (Exchange Online, DKIM, Intune/MDM).</w:t>
+        <w:t>Forte integracao com Microsoft 365 (Exchange Online, DKIM, Intune/MDM).</w:t>
       </w:r>
     </w:p>
     <w:p>
@@ -786,7 +800,7 @@
         <w:pStyle w:val="ListBullet"/>
       </w:pPr>
       <w:r>
-        <w:t>www aponta para holambra.aatb.com.br (provável agência/hosting externo AATB).</w:t>
+        <w:t>www aponta para holambra.aatb.com.br (provavel agencia/hosting externo AATB).</w:t>
       </w:r>
     </w:p>
     <w:p>
@@ -799,7 +813,18 @@
         <w:pStyle w:val="Heading1"/>
       </w:pPr>
       <w:r>
-        <w:t>2. FASE 1 – Desabilitar DNSSEC no Registro.br</w:t>
+        <w:t>2. FASE 1 - Desabilitar DNSSEC no Registro.br</w:t>
+      </w:r>
+    </w:p>
+    <w:p>
+      <w:r>
+        <w:rPr>
+          <w:b/>
+        </w:rPr>
+        <w:t xml:space="preserve">Resumo: </w:t>
+      </w:r>
+      <w:r>
+        <w:t>Esta fase remove a protecao DNSSEC para permitir a futura troca de nameservers para o Azure. Para o passo a passo completo, com telas e os dois cenarios possiveis, consulte o ANEXO A.</w:t>
       </w:r>
     </w:p>
     <w:p>
@@ -807,7 +832,7 @@
         <w:pStyle w:val="Heading2"/>
       </w:pPr>
       <w:r>
-        <w:t>Passo 1.1 – Acessar o painel do Registro.br</w:t>
+        <w:t>Passo 1.1 - Acessar o painel do Registro.br</w:t>
       </w:r>
     </w:p>
     <w:p>
@@ -815,7 +840,7 @@
         <w:pStyle w:val="ListNumber"/>
       </w:pPr>
       <w:r>
-        <w:t>Acesse https://registro.br e faça login com as credenciais do titular do domínio.</w:t>
+        <w:t>Acesse https://registro.br e faca login com as credenciais do titular do dominio.</w:t>
       </w:r>
     </w:p>
     <w:p>
@@ -823,7 +848,7 @@
         <w:pStyle w:val="ListNumber"/>
       </w:pPr>
       <w:r>
-        <w:t>No painel, localize e clique no domínio holambra.com.br.</w:t>
+        <w:t>No painel, localize e clique no dominio holambra.com.br.</w:t>
       </w:r>
     </w:p>
     <w:p>
@@ -831,7 +856,15 @@
         <w:pStyle w:val="Heading2"/>
       </w:pPr>
       <w:r>
-        <w:t>Passo 1.2 – Remover o registro DS (Delegation Signer)</w:t>
+        <w:t>Passo 1.2 - Desabilitar o DNSSEC / Remover o registro DS</w:t>
+      </w:r>
+    </w:p>
+    <w:p>
+      <w:r>
+        <w:rPr>
+          <w:b/>
+        </w:rPr>
+        <w:t>Cenario A (caso do holambra.com.br - DNS gerenciado pelo Registro.br):</w:t>
       </w:r>
     </w:p>
     <w:p>
@@ -839,7 +872,7 @@
         <w:pStyle w:val="ListNumber"/>
       </w:pPr>
       <w:r>
-        <w:t>Na página do domínio, role até a seção "Alterar Servidores DNS".</w:t>
+        <w:t>Localize a secao DNSSEC e desligue o toggle "Habilitado".</w:t>
       </w:r>
     </w:p>
     <w:p>
@@ -847,7 +880,7 @@
         <w:pStyle w:val="ListNumber"/>
       </w:pPr>
       <w:r>
-        <w:t>Localize a seção DNSSEC (ou clique em "+DNSSEC" para expandir).</w:t>
+        <w:t>Clique em Salvar alteracoes e confirme.</w:t>
       </w:r>
     </w:p>
     <w:p>
@@ -855,7 +888,15 @@
         <w:pStyle w:val="ListNumber"/>
       </w:pPr>
       <w:r>
-        <w:t>Você verá o DS record com Key Tag 9221, algoritmo 13, digest type 2.</w:t>
+        <w:t>O Registro.br remove o DS do .br e des-assina a zona automaticamente.</w:t>
+      </w:r>
+    </w:p>
+    <w:p>
+      <w:r>
+        <w:rPr>
+          <w:b/>
+        </w:rPr>
+        <w:t>Cenario B (se a tela mostrar entrada manual de DS - DNS externo):</w:t>
       </w:r>
     </w:p>
     <w:p>
@@ -863,7 +904,7 @@
         <w:pStyle w:val="ListNumber"/>
       </w:pPr>
       <w:r>
-        <w:t>Clique no botão para remover/excluir o registro DS.</w:t>
+        <w:t>Expanda "+DNSSEC".</w:t>
       </w:r>
     </w:p>
     <w:p>
@@ -871,7 +912,15 @@
         <w:pStyle w:val="ListNumber"/>
       </w:pPr>
       <w:r>
-        <w:t>Confirme a remoção.</w:t>
+        <w:t>Localize o DS com Key Tag 9221, algoritmo 13, digest type 2.</w:t>
+      </w:r>
+    </w:p>
+    <w:p>
+      <w:pPr>
+        <w:pStyle w:val="ListNumber"/>
+      </w:pPr>
+      <w:r>
+        <w:t>Clique no icone de remover/excluir (lixeira) e salve.</w:t>
       </w:r>
     </w:p>
     <w:p>
@@ -880,10 +929,10 @@
           <w:b/>
           <w:color w:val="CC0000"/>
         </w:rPr>
-        <w:t xml:space="preserve">⚠ ATENÇÃO CRÍTICA: </w:t>
+        <w:t xml:space="preserve">ATENCAO CRITICA: </w:t>
       </w:r>
       <w:r>
-        <w:t>Você está removendo APENAS o registro DS no registrar (Registro.br). Você NÃO está desativando a assinatura da zona. Esta é a ordem correta. Se inverter (desativar assinatura antes de remover DS), causará SERVFAIL e o domínio ficará fora do ar para resolvedores que validam DNSSEC.</w:t>
+        <w:t>Nunca troque os nameservers para o Azure antes de remover o DS e aguardar o TTL. Se inverter a ordem, a cadeia DNSSEC quebra e causa SERVFAIL (dominio fora do ar para resolvedores que validam).</w:t>
       </w:r>
     </w:p>
     <w:p>
@@ -891,7 +940,7 @@
         <w:pStyle w:val="Heading2"/>
       </w:pPr>
       <w:r>
-        <w:t>Passo 1.3 – Aguardar propagação do TTL do DS</w:t>
+        <w:t>Passo 1.3 - Aguardar propagacao do TTL do DS</w:t>
       </w:r>
     </w:p>
     <w:p>
@@ -899,7 +948,7 @@
         <w:pStyle w:val="ListBullet"/>
       </w:pPr>
       <w:r>
-        <w:t>O TTL do DS record é de 3600 segundos (1 hora).</w:t>
+        <w:t>O TTL do DS record e de 3600 segundos (1 hora).</w:t>
       </w:r>
     </w:p>
     <w:p>
@@ -907,15 +956,7 @@
         <w:pStyle w:val="ListBullet"/>
       </w:pPr>
       <w:r>
-        <w:t>Aguarde no mínimo 2 horas (recomendado 4-6 horas) após a remoção.</w:t>
-      </w:r>
-    </w:p>
-    <w:p>
-      <w:pPr>
-        <w:pStyle w:val="ListBullet"/>
-      </w:pPr>
-      <w:r>
-        <w:t>Isso garante que todos os caches de DNS ao redor do mundo expirem o DS record antigo.</w:t>
+        <w:t>Aguarde no minimo 2 horas (recomendado 4-6 horas) apos a remocao.</w:t>
       </w:r>
     </w:p>
     <w:p>
@@ -923,12 +964,7 @@
         <w:pStyle w:val="Heading2"/>
       </w:pPr>
       <w:r>
-        <w:t>Passo 1.4 – Validar a remoção do DS</w:t>
-      </w:r>
-    </w:p>
-    <w:p>
-      <w:r>
-        <w:t>Execute os seguintes comandos para confirmar que o DS foi removido:</w:t>
+        <w:t>Passo 1.4 - Validar a remocao do DS</w:t>
       </w:r>
     </w:p>
     <w:p>
@@ -942,23 +978,21 @@
     </w:p>
     <w:p>
       <w:r>
-        <w:rPr>
-          <w:sz w:val="20"/>
-        </w:rPr>
-        <w:t>Ou via navegador: https://dns.google/resolve?name=holambra.com.br&amp;type=DS</w:t>
-      </w:r>
-    </w:p>
-    <w:p>
-      <w:r>
-        <w:t>O campo "Answer" deve estar ausente ou vazio.</w:t>
+        <w:t>O campo Answer deve estar ausente ou vazio.</w:t>
       </w:r>
     </w:p>
     <w:p>
       <w:r>
         <w:rPr>
-          <w:sz w:val="20"/>
+          <w:rFonts w:ascii="Consolas" w:hAnsi="Consolas"/>
+          <w:sz w:val="18"/>
         </w:rPr>
-        <w:t>Validar também em: https://dnsviz.net/d/holambra.com.br/dnssec/</w:t>
+        <w:t>nslookup holambra.com.br 8.8.8.8</w:t>
+      </w:r>
+    </w:p>
+    <w:p>
+      <w:r>
+        <w:t>Validar tambem em: https://dnsviz.net/d/holambra.com.br/dnssec/</w:t>
       </w:r>
     </w:p>
     <w:p>
@@ -966,7 +1000,7 @@
         <w:rPr>
           <w:b/>
         </w:rPr>
-        <w:t>Só prossiga para a Fase 2 quando o DS for confirmado como removido.</w:t>
+        <w:t>So prossiga para a Fase 2 quando o DS for confirmado como removido.</w:t>
       </w:r>
     </w:p>
     <w:p>
@@ -979,7 +1013,7 @@
         <w:pStyle w:val="Heading1"/>
       </w:pPr>
       <w:r>
-        <w:t>3. FASE 2 – Criar a Zona DNS no Azure</w:t>
+        <w:t>3. FASE 2 - Criar a Zona DNS no Azure</w:t>
       </w:r>
     </w:p>
     <w:p>
@@ -987,44 +1021,12 @@
         <w:pStyle w:val="Heading2"/>
       </w:pPr>
       <w:r>
-        <w:t>Passo 2.1 – Criar a zona DNS no Azure Portal</w:t>
-      </w:r>
-    </w:p>
-    <w:p>
-      <w:pPr>
-        <w:pStyle w:val="ListNumber"/>
-      </w:pPr>
-      <w:r>
-        <w:t>Acesse o Azure Portal &gt; DNS Zones &gt; + Create.</w:t>
-      </w:r>
-    </w:p>
-    <w:p>
-      <w:pPr>
-        <w:pStyle w:val="ListNumber"/>
-      </w:pPr>
-      <w:r>
-        <w:t>Selecione o Resource Group adequado (a definir com o cliente).</w:t>
-      </w:r>
-    </w:p>
-    <w:p>
-      <w:pPr>
-        <w:pStyle w:val="ListNumber"/>
-      </w:pPr>
-      <w:r>
-        <w:t>Nome da zona: holambra.com.br | Tipo: Public.</w:t>
-      </w:r>
-    </w:p>
-    <w:p>
-      <w:pPr>
-        <w:pStyle w:val="ListNumber"/>
-      </w:pPr>
-      <w:r>
-        <w:t>Clique em Review + Create &gt; Create.</w:t>
+        <w:t>Passo 2.1 - Criar a zona DNS</w:t>
       </w:r>
     </w:p>
     <w:p>
       <w:r>
-        <w:t>Ou via Azure CLI:</w:t>
+        <w:t>Azure Portal &gt; DNS Zones &gt; + Create. Resource Group a definir com o cliente. Nome da zona: holambra.com.br | Tipo: Public.</w:t>
       </w:r>
     </w:p>
     <w:p>
@@ -1041,12 +1043,12 @@
         <w:pStyle w:val="Heading2"/>
       </w:pPr>
       <w:r>
-        <w:t>Passo 2.2 – Anotar os Nameservers do Azure</w:t>
+        <w:t>Passo 2.2 - Anotar os Nameservers do Azure</w:t>
       </w:r>
     </w:p>
     <w:p>
       <w:r>
-        <w:t>Após a criação, o Azure atribuirá 4 nameservers (ex: ns1-XX.azure-dns.com, ns2-XX.azure-dns.net, ns3-XX.azure-dns.org, ns4-XX.azure-dns.info). Anote-os.</w:t>
+        <w:t>Apos a criacao o Azure atribuira 4 nameservers (ex: ns1-XX.azure-dns.com, ns2-XX.azure-dns.net, ns3-XX.azure-dns.org, ns4-XX.azure-dns.info). Anote-os.</w:t>
       </w:r>
     </w:p>
     <w:p>
@@ -1054,12 +1056,7 @@
         <w:pStyle w:val="Heading2"/>
       </w:pPr>
       <w:r>
-        <w:t>Passo 2.3 – Recriar TODOS os registros DNS no Azure</w:t>
-      </w:r>
-    </w:p>
-    <w:p>
-      <w:r>
-        <w:t>Recriar cada registro na zona do Azure antes de apontar os NS:</w:t>
+        <w:t>Passo 2.3 - Recriar TODOS os registros DNS no Azure</w:t>
       </w:r>
     </w:p>
     <w:p>
@@ -1104,7 +1101,7 @@
           <w:b/>
           <w:sz w:val="20"/>
         </w:rPr>
-        <w:t>TXT – SPF (raiz)</w:t>
+        <w:t>TXT - SPF (raiz)</w:t>
       </w:r>
     </w:p>
     <w:p>
@@ -1122,7 +1119,7 @@
           <w:b/>
           <w:sz w:val="20"/>
         </w:rPr>
-        <w:t>TXT – DMARC</w:t>
+        <w:t>TXT - DMARC</w:t>
       </w:r>
     </w:p>
     <w:p>
@@ -1140,7 +1137,7 @@
           <w:b/>
           <w:sz w:val="20"/>
         </w:rPr>
-        <w:t>CNAME – www</w:t>
+        <w:t>CNAME - www</w:t>
       </w:r>
     </w:p>
     <w:p>
@@ -1158,7 +1155,7 @@
           <w:b/>
           <w:sz w:val="20"/>
         </w:rPr>
-        <w:t>CNAME – autodiscover</w:t>
+        <w:t>CNAME - autodiscover</w:t>
       </w:r>
     </w:p>
     <w:p>
@@ -1176,7 +1173,7 @@
           <w:b/>
           <w:sz w:val="20"/>
         </w:rPr>
-        <w:t>CNAME – DKIM selector1</w:t>
+        <w:t>CNAME - DKIM selector1</w:t>
       </w:r>
     </w:p>
     <w:p>
@@ -1194,7 +1191,7 @@
           <w:b/>
           <w:sz w:val="20"/>
         </w:rPr>
-        <w:t>CNAME – Enterprise Registration</w:t>
+        <w:t>CNAME - Enterprise Registration</w:t>
       </w:r>
     </w:p>
     <w:p>
@@ -1212,7 +1209,7 @@
           <w:b/>
           <w:sz w:val="20"/>
         </w:rPr>
-        <w:t>CNAME – Enterprise Enrollment</w:t>
+        <w:t>CNAME - Enterprise Enrollment</w:t>
       </w:r>
     </w:p>
     <w:p>
@@ -1229,12 +1226,7 @@
         <w:pStyle w:val="Heading2"/>
       </w:pPr>
       <w:r>
-        <w:t>Passo 2.4 – Validar os registros no Azure (ANTES de apontar NS)</w:t>
-      </w:r>
-    </w:p>
-    <w:p>
-      <w:r>
-        <w:t>Consultar diretamente os nameservers do Azure para confirmar que todos os registros estão corretos. Substituir ns1-XX.azure-dns.com pelo NS real:</w:t>
+        <w:t>Passo 2.4 - Validar os registros no Azure (ANTES de apontar NS)</w:t>
       </w:r>
     </w:p>
     <w:p>
@@ -1284,24 +1276,6 @@
     </w:p>
     <w:p>
       <w:r>
-        <w:rPr>
-          <w:rFonts w:ascii="Consolas" w:hAnsi="Consolas"/>
-          <w:sz w:val="18"/>
-        </w:rPr>
-        <w:t>nslookup -type=TXT _dmarc.holambra.com.br ns1-XX.azure-dns.com</w:t>
-      </w:r>
-    </w:p>
-    <w:p>
-      <w:r>
-        <w:rPr>
-          <w:rFonts w:ascii="Consolas" w:hAnsi="Consolas"/>
-          <w:sz w:val="18"/>
-        </w:rPr>
-        <w:t>nslookup -type=CNAME selector1._domainkey.holambra.com.br ns1-XX.azure-dns.com</w:t>
-      </w:r>
-    </w:p>
-    <w:p>
-      <w:r>
         <w:br w:type="page"/>
       </w:r>
     </w:p>
@@ -1310,7 +1284,7 @@
         <w:pStyle w:val="Heading1"/>
       </w:pPr>
       <w:r>
-        <w:t>4. FASE 3 – Apontar os Nameservers no Registro.br</w:t>
+        <w:t>4. FASE 3 - Apontar os Nameservers no Registro.br</w:t>
       </w:r>
     </w:p>
     <w:p>
@@ -1318,7 +1292,7 @@
         <w:pStyle w:val="Heading2"/>
       </w:pPr>
       <w:r>
-        <w:t>Passo 3.1 – Alterar os NS no Registro.br</w:t>
+        <w:t>Passo 3.1 - Alterar os NS no Registro.br</w:t>
       </w:r>
     </w:p>
     <w:p>
@@ -1326,7 +1300,7 @@
         <w:pStyle w:val="ListNumber"/>
       </w:pPr>
       <w:r>
-        <w:t>Acesse https://registro.br &gt; login &gt; selecione holambra.com.br.</w:t>
+        <w:t>Acesse o dominio &gt; secao DNS &gt; Alterar Servidores DNS.</w:t>
       </w:r>
     </w:p>
     <w:p>
@@ -1334,7 +1308,7 @@
         <w:pStyle w:val="ListNumber"/>
       </w:pPr>
       <w:r>
-        <w:t>Na seção "Alterar Servidores DNS".</w:t>
+        <w:t>Remova b.sec.dns.br e c.sec.dns.br.</w:t>
       </w:r>
     </w:p>
     <w:p>
@@ -1342,7 +1316,7 @@
         <w:pStyle w:val="ListNumber"/>
       </w:pPr>
       <w:r>
-        <w:t>Remova os servidores atuais (b.sec.dns.br e c.sec.dns.br).</w:t>
+        <w:t>Adicione os 4 nameservers do Azure (Passo 2.2).</w:t>
       </w:r>
     </w:p>
     <w:p>
@@ -1350,26 +1324,19 @@
         <w:pStyle w:val="ListNumber"/>
       </w:pPr>
       <w:r>
-        <w:t>Adicione os 4 nameservers do Azure DNS (obtidos no Passo 2.2).</w:t>
-      </w:r>
-    </w:p>
-    <w:p>
-      <w:pPr>
-        <w:pStyle w:val="ListNumber"/>
-      </w:pPr>
-      <w:r>
-        <w:t>Salve as alterações.</w:t>
+        <w:t>Salve as alteracoes.</w:t>
       </w:r>
     </w:p>
     <w:p>
       <w:r>
         <w:rPr>
           <w:b/>
+          <w:color w:val="000000"/>
         </w:rPr>
         <w:t xml:space="preserve">Nota: </w:t>
       </w:r>
       <w:r>
-        <w:t>Para alterar DNS manualmente, o Provedor deve estar configurado como "NENHUM". Se houver um provedor vinculado, será necessário desvinculá-lo primeiro.</w:t>
+        <w:t>Para alterar DNS, o Provedor de Servicos deve estar como "Nenhum". Se houver provedor vinculado, desvincule antes.</w:t>
       </w:r>
     </w:p>
     <w:p>
@@ -1377,23 +1344,7 @@
         <w:pStyle w:val="Heading2"/>
       </w:pPr>
       <w:r>
-        <w:t>Passo 3.2 – Aguardar propagação</w:t>
-      </w:r>
-    </w:p>
-    <w:p>
-      <w:pPr>
-        <w:pStyle w:val="ListBullet"/>
-      </w:pPr>
-      <w:r>
-        <w:t>A propagação de NS pode levar de 2 a 48 horas.</w:t>
-      </w:r>
-    </w:p>
-    <w:p>
-      <w:pPr>
-        <w:pStyle w:val="ListBullet"/>
-      </w:pPr>
-      <w:r>
-        <w:t>Durante esse período, alguns usuários podem resolver pelo DNS antigo e outros pelo novo (ambos devem ter os mesmos registros).</w:t>
+        <w:t>Passo 3.2 - Aguardar propagacao (2 a 48 horas)</w:t>
       </w:r>
     </w:p>
     <w:p>
@@ -1401,7 +1352,7 @@
         <w:pStyle w:val="Heading2"/>
       </w:pPr>
       <w:r>
-        <w:t>Passo 3.3 – Validar a migração</w:t>
+        <w:t>Passo 3.3 - Validar a migracao</w:t>
       </w:r>
     </w:p>
     <w:p>
@@ -1419,25 +1370,7 @@
           <w:rFonts w:ascii="Consolas" w:hAnsi="Consolas"/>
           <w:sz w:val="18"/>
         </w:rPr>
-        <w:t>nslookup holambra.com.br</w:t>
-      </w:r>
-    </w:p>
-    <w:p>
-      <w:r>
-        <w:rPr>
-          <w:rFonts w:ascii="Consolas" w:hAnsi="Consolas"/>
-          <w:sz w:val="18"/>
-        </w:rPr>
         <w:t>nslookup -type=MX holambra.com.br</w:t>
-      </w:r>
-    </w:p>
-    <w:p>
-      <w:r>
-        <w:rPr>
-          <w:rFonts w:ascii="Consolas" w:hAnsi="Consolas"/>
-          <w:sz w:val="18"/>
-        </w:rPr>
-        <w:t>nslookup -type=TXT holambra.com.br</w:t>
       </w:r>
     </w:p>
     <w:p>
@@ -1450,29 +1383,11 @@
       </w:r>
     </w:p>
     <w:p>
-      <w:r>
-        <w:rPr>
-          <w:rFonts w:ascii="Consolas" w:hAnsi="Consolas"/>
-          <w:sz w:val="18"/>
-        </w:rPr>
-        <w:t>nslookup -type=CNAME autodiscover.holambra.com.br</w:t>
-      </w:r>
-    </w:p>
-    <w:p/>
-    <w:p>
       <w:pPr>
         <w:pStyle w:val="ListBullet"/>
       </w:pPr>
       <w:r>
-        <w:t>Testar envio/recebimento de e-mail para confirmar que MX está funcionando.</w:t>
-      </w:r>
-    </w:p>
-    <w:p>
-      <w:pPr>
-        <w:pStyle w:val="ListBullet"/>
-      </w:pPr>
-      <w:r>
-        <w:t>Testar acesso ao site www.holambra.com.br.</w:t>
+        <w:t>Testar envio/recebimento de e-mail e acesso ao site www.holambra.com.br.</w:t>
       </w:r>
     </w:p>
     <w:p>
@@ -1485,20 +1400,12 @@
         <w:pStyle w:val="Heading1"/>
       </w:pPr>
       <w:r>
-        <w:t>5. FASE 4 – Reabilitar DNSSEC no Azure DNS (opcional, recomendado)</w:t>
+        <w:t>5. FASE 4 - Reabilitar DNSSEC no Azure DNS (opcional, recomendado)</w:t>
       </w:r>
     </w:p>
     <w:p>
       <w:r>
-        <w:t>Após a migração estar estável (aguardar 48-72h):</w:t>
-      </w:r>
-    </w:p>
-    <w:p>
-      <w:pPr>
-        <w:pStyle w:val="Heading2"/>
-      </w:pPr>
-      <w:r>
-        <w:t>Passo 4.1 – Habilitar DNSSEC no Azure DNS</w:t>
+        <w:t>Apos a migracao estar estavel (aguardar 48-72h):</w:t>
       </w:r>
     </w:p>
     <w:p>
@@ -1506,28 +1413,7 @@
         <w:pStyle w:val="ListNumber"/>
       </w:pPr>
       <w:r>
-        <w:t>Azure Portal &gt; DNS Zones &gt; holambra.com.br &gt; DNSSEC.</w:t>
-      </w:r>
-    </w:p>
-    <w:p>
-      <w:pPr>
-        <w:pStyle w:val="ListNumber"/>
-      </w:pPr>
-      <w:r>
-        <w:t>Marque Enable DNSSEC.</w:t>
-      </w:r>
-    </w:p>
-    <w:p>
-      <w:pPr>
-        <w:pStyle w:val="ListNumber"/>
-      </w:pPr>
-      <w:r>
-        <w:t>O Azure gerará novos DS records.</w:t>
-      </w:r>
-    </w:p>
-    <w:p>
-      <w:r>
-        <w:t>Ou via CLI:</w:t>
+        <w:t>Azure Portal &gt; DNS Zones &gt; holambra.com.br &gt; DNSSEC &gt; Enable DNSSEC.</w:t>
       </w:r>
     </w:p>
     <w:p>
@@ -1537,14 +1423,6 @@
           <w:sz w:val="18"/>
         </w:rPr>
         <w:t>az network dns dnssec-config create --resource-group "&lt;RG&gt;" --zone-name "holambra.com.br"</w:t>
-      </w:r>
-    </w:p>
-    <w:p>
-      <w:pPr>
-        <w:pStyle w:val="Heading2"/>
-      </w:pPr>
-      <w:r>
-        <w:t>Passo 4.2 – Adicionar o novo DS no Registro.br</w:t>
       </w:r>
     </w:p>
     <w:p>
@@ -1560,7 +1438,7 @@
         <w:pStyle w:val="ListNumber"/>
       </w:pPr>
       <w:r>
-        <w:t>No Registro.br, adicione o novo DS via seção DNSSEC.</w:t>
+        <w:t>No Registro.br, adicione o novo DS via secao DNSSEC e aguarde 1-2h.</w:t>
       </w:r>
     </w:p>
     <w:p>
@@ -1568,39 +1446,7 @@
         <w:pStyle w:val="ListNumber"/>
       </w:pPr>
       <w:r>
-        <w:t>Aguarde propagação (1-2 horas).</w:t>
-      </w:r>
-    </w:p>
-    <w:p>
-      <w:pPr>
-        <w:pStyle w:val="Heading2"/>
-      </w:pPr>
-      <w:r>
-        <w:t>Passo 4.3 – Validar DNSSEC</w:t>
-      </w:r>
-    </w:p>
-    <w:p>
-      <w:pPr>
-        <w:pStyle w:val="ListBullet"/>
-      </w:pPr>
-      <w:r>
-        <w:t>Acesse https://dnsviz.net/d/holambra.com.br/dnssec/</w:t>
-      </w:r>
-    </w:p>
-    <w:p>
-      <w:pPr>
-        <w:pStyle w:val="ListBullet"/>
-      </w:pPr>
-      <w:r>
-        <w:t>Acesse https://dns.google/resolve?name=holambra.com.br&amp;type=A&amp;do=1</w:t>
-      </w:r>
-    </w:p>
-    <w:p>
-      <w:pPr>
-        <w:pStyle w:val="ListBullet"/>
-      </w:pPr>
-      <w:r>
-        <w:t>A flag AD deve retornar true.</w:t>
+        <w:t>Validar: a flag AD deve retornar true em https://dnsviz.net/d/holambra.com.br/dnssec/</w:t>
       </w:r>
     </w:p>
     <w:p>
@@ -1644,7 +1490,7 @@
           </w:tcPr>
           <w:p>
             <w:r>
-              <w:t>Ação</w:t>
+              <w:t>Acao</w:t>
             </w:r>
           </w:p>
         </w:tc>
@@ -1656,7 +1502,7 @@
           </w:tcPr>
           <w:p>
             <w:r>
-              <w:t>Dia 1 (início, horário de baixo tráfego)</w:t>
+              <w:t>Dia 1 (horario de baixo trafego)</w:t>
             </w:r>
           </w:p>
         </w:tc>
@@ -1666,7 +1512,7 @@
           </w:tcPr>
           <w:p>
             <w:r>
-              <w:t>Fase 1 – Remover DS do DNSSEC no Registro.br</w:t>
+              <w:t>Fase 1 - Desabilitar DNSSEC no Registro.br</w:t>
             </w:r>
           </w:p>
         </w:tc>
@@ -1688,7 +1534,7 @@
           </w:tcPr>
           <w:p>
             <w:r>
-              <w:t>Validar remoção do DS</w:t>
+              <w:t>Validar remocao do DS</w:t>
             </w:r>
           </w:p>
         </w:tc>
@@ -1710,7 +1556,7 @@
           </w:tcPr>
           <w:p>
             <w:r>
-              <w:t>Fase 2 – Criar zona e registros no Azure DNS</w:t>
+              <w:t>Fase 2 - Criar zona e registros no Azure DNS</w:t>
             </w:r>
           </w:p>
         </w:tc>
@@ -1732,7 +1578,7 @@
           </w:tcPr>
           <w:p>
             <w:r>
-              <w:t>Fase 3 – Apontar NS para Azure no Registro.br</w:t>
+              <w:t>Fase 3 - Apontar NS para Azure no Registro.br</w:t>
             </w:r>
           </w:p>
         </w:tc>
@@ -1754,7 +1600,7 @@
           </w:tcPr>
           <w:p>
             <w:r>
-              <w:t>Validação completa da migração</w:t>
+              <w:t>Validacao completa da migracao</w:t>
             </w:r>
           </w:p>
         </w:tc>
@@ -1776,7 +1622,7 @@
           </w:tcPr>
           <w:p>
             <w:r>
-              <w:t>Fase 4 – Reabilitar DNSSEC no Azure DNS (quando estabilizado)</w:t>
+              <w:t>Fase 4 - Reabilitar DNSSEC no Azure DNS</w:t>
             </w:r>
           </w:p>
         </w:tc>
@@ -1792,7 +1638,7 @@
         <w:pStyle w:val="Heading1"/>
       </w:pPr>
       <w:r>
-        <w:t>7. Riscos e Mitigações</w:t>
+        <w:t>7. Riscos e Mitigacoes</w:t>
       </w:r>
     </w:p>
     <w:tbl>
@@ -1823,7 +1669,7 @@
           </w:tcPr>
           <w:p>
             <w:r>
-              <w:t>Mitigação</w:t>
+              <w:t>Mitigacao</w:t>
             </w:r>
           </w:p>
         </w:tc>
@@ -1857,7 +1703,7 @@
           </w:tcPr>
           <w:p>
             <w:r>
-              <w:t>Esquecer algum registro DNS na migração</w:t>
+              <w:t>Esquecer algum registro DNS na migracao</w:t>
             </w:r>
           </w:p>
         </w:tc>
@@ -1867,7 +1713,7 @@
           </w:tcPr>
           <w:p>
             <w:r>
-              <w:t>Inventário completo já documentado; validar contra NS do Azure antes de apontar.</w:t>
+              <w:t>Inventario completo documentado; validar contra NS do Azure antes de apontar.</w:t>
             </w:r>
           </w:p>
         </w:tc>
@@ -1889,7 +1735,7 @@
           </w:tcPr>
           <w:p>
             <w:r>
-              <w:t>Priorizar validação de registros de e-mail; testar envio/recebimento imediatamente após apontar NS.</w:t>
+              <w:t>Priorizar validacao de e-mail; testar envio/recebimento apos apontar NS.</w:t>
             </w:r>
           </w:p>
         </w:tc>
@@ -1917,6 +1763,601 @@
         </w:tc>
       </w:tr>
     </w:tbl>
+    <w:p>
+      <w:r>
+        <w:br w:type="page"/>
+      </w:r>
+    </w:p>
+    <w:p>
+      <w:pPr>
+        <w:pStyle w:val="Heading1"/>
+      </w:pPr>
+      <w:r>
+        <w:t>ANEXO A - Guia Detalhado: Como Desabilitar o DNSSEC no Registro.br</w:t>
+      </w:r>
+    </w:p>
+    <w:p>
+      <w:pPr>
+        <w:pStyle w:val="Heading2"/>
+      </w:pPr>
+      <w:r>
+        <w:t>A.1. O que e DNSSEC (para explicar ao cliente)</w:t>
+      </w:r>
+    </w:p>
+    <w:p>
+      <w:r>
+        <w:t>O DNSSEC e um "selo de autenticidade" criptografico nas respostas DNS, que impede a falsificacao do endereco do dominio (DNS spoofing / cache poisoning). Ele funciona como uma cadeia de confianca com duas pecas que precisam combinar entre si:</w:t>
+      </w:r>
+    </w:p>
+    <w:tbl>
+      <w:tblPr>
+        <w:tblStyle w:val="LightGrid-Accent1"/>
+        <w:tblW w:type="auto" w:w="0"/>
+        <w:jc w:val="center"/>
+        <w:tblLook w:firstColumn="1" w:firstRow="1" w:lastColumn="0" w:lastRow="0" w:noHBand="0" w:noVBand="1" w:val="04A0"/>
+      </w:tblPr>
+      <w:tblGrid>
+        <w:gridCol w:w="2880"/>
+        <w:gridCol w:w="2880"/>
+        <w:gridCol w:w="2880"/>
+      </w:tblGrid>
+      <w:tr>
+        <w:tc>
+          <w:tcPr>
+            <w:tcW w:type="dxa" w:w="2880"/>
+          </w:tcPr>
+          <w:p>
+            <w:r>
+              <w:t>Peca</w:t>
+            </w:r>
+          </w:p>
+        </w:tc>
+        <w:tc>
+          <w:tcPr>
+            <w:tcW w:type="dxa" w:w="2880"/>
+          </w:tcPr>
+          <w:p>
+            <w:r>
+              <w:t>Onde fica</w:t>
+            </w:r>
+          </w:p>
+        </w:tc>
+        <w:tc>
+          <w:tcPr>
+            <w:tcW w:type="dxa" w:w="2880"/>
+          </w:tcPr>
+          <w:p>
+            <w:r>
+              <w:t>O que e</w:t>
+            </w:r>
+          </w:p>
+        </w:tc>
+      </w:tr>
+      <w:tr>
+        <w:tc>
+          <w:tcPr>
+            <w:tcW w:type="dxa" w:w="2880"/>
+          </w:tcPr>
+          <w:p>
+            <w:r>
+              <w:t>Zona assinada (DNSKEY/RRSIG)</w:t>
+            </w:r>
+          </w:p>
+        </w:tc>
+        <w:tc>
+          <w:tcPr>
+            <w:tcW w:type="dxa" w:w="2880"/>
+          </w:tcPr>
+          <w:p>
+            <w:r>
+              <w:t>No servidor DNS (hoje: Registro.br)</w:t>
+            </w:r>
+          </w:p>
+        </w:tc>
+        <w:tc>
+          <w:tcPr>
+            <w:tcW w:type="dxa" w:w="2880"/>
+          </w:tcPr>
+          <w:p>
+            <w:r>
+              <w:t>As respostas DNS carimbadas com a chave privada</w:t>
+            </w:r>
+          </w:p>
+        </w:tc>
+      </w:tr>
+      <w:tr>
+        <w:tc>
+          <w:tcPr>
+            <w:tcW w:type="dxa" w:w="2880"/>
+          </w:tcPr>
+          <w:p>
+            <w:r>
+              <w:t>Registro DS</w:t>
+            </w:r>
+          </w:p>
+        </w:tc>
+        <w:tc>
+          <w:tcPr>
+            <w:tcW w:type="dxa" w:w="2880"/>
+          </w:tcPr>
+          <w:p>
+            <w:r>
+              <w:t>Na zona pai .br (NIC.br)</w:t>
+            </w:r>
+          </w:p>
+        </w:tc>
+        <w:tc>
+          <w:tcPr>
+            <w:tcW w:type="dxa" w:w="2880"/>
+          </w:tcPr>
+          <w:p>
+            <w:r>
+              <w:t>A impressao digital da chave publica que valida o carimbo</w:t>
+            </w:r>
+          </w:p>
+        </w:tc>
+      </w:tr>
+    </w:tbl>
+    <w:p/>
+    <w:p>
+      <w:r>
+        <w:rPr>
+          <w:b/>
+          <w:color w:val="000000"/>
+        </w:rPr>
+        <w:t xml:space="preserve">Regra de ouro: </w:t>
+      </w:r>
+      <w:r>
+        <w:t>o DS na zona pai precisa SEMPRE combinar com a chave que assina a zona. Se um existe sem o outro, os resolvedores que validam DNSSEC retornam SERVFAIL.</w:t>
+      </w:r>
+    </w:p>
+    <w:p>
+      <w:pPr>
+        <w:pStyle w:val="Heading2"/>
+      </w:pPr>
+      <w:r>
+        <w:t>A.2. Por que precisamos desligar antes de migrar</w:t>
+      </w:r>
+    </w:p>
+    <w:p>
+      <w:r>
+        <w:t>Hoje a zona e assinada pelas chaves do Registro.br. Ao mudar os nameservers para o Azure, a zona passa a ser servida pelo Azure, que nao possui essas chaves. Se o DS antigo continuar publicado no .br, a cadeia quebra (SERVFAIL). Por isso: desligar o DNSSEC primeiro, migrar depois e reativar o DNSSEC ja no Azure com chaves e DS novos.</w:t>
+      </w:r>
+    </w:p>
+    <w:p>
+      <w:pPr>
+        <w:pStyle w:val="Heading2"/>
+      </w:pPr>
+      <w:r>
+        <w:t>A.3. Tela do painel (ilustrativa)</w:t>
+      </w:r>
+    </w:p>
+    <w:p>
+      <w:r>
+        <w:t>Abaixo, uma representacao ilustrativa de como o painel do dominio se apresenta. A imagem e ilustrativa - a tela real pode variar em layout, mas os elementos (bloco DNS, secao DNSSEC e Provedor de Servicos) sao os mesmos.</w:t>
+      </w:r>
+    </w:p>
+    <w:p>
+      <w:pPr>
+        <w:jc w:val="center"/>
+      </w:pPr>
+      <w:r>
+        <w:drawing>
+          <wp:inline xmlns:a="http://schemas.openxmlformats.org/drawingml/2006/main" xmlns:pic="http://schemas.openxmlformats.org/drawingml/2006/picture">
+            <wp:extent cx="5486400" cy="3657600"/>
+            <wp:docPr id="1" name="Picture 1"/>
+            <wp:cNvGraphicFramePr>
+              <a:graphicFrameLocks noChangeAspect="1"/>
+            </wp:cNvGraphicFramePr>
+            <a:graphic>
+              <a:graphicData uri="http://schemas.openxmlformats.org/drawingml/2006/picture">
+                <pic:pic>
+                  <pic:nvPicPr>
+                    <pic:cNvPr id="0" name="registrobr_dnssec_mockup.png"/>
+                    <pic:cNvPicPr/>
+                  </pic:nvPicPr>
+                  <pic:blipFill>
+                    <a:blip r:embed="rId9"/>
+                    <a:stretch>
+                      <a:fillRect/>
+                    </a:stretch>
+                  </pic:blipFill>
+                  <pic:spPr>
+                    <a:xfrm>
+                      <a:off x="0" y="0"/>
+                      <a:ext cx="5486400" cy="3657600"/>
+                    </a:xfrm>
+                    <a:prstGeom prst="rect"/>
+                  </pic:spPr>
+                </pic:pic>
+              </a:graphicData>
+            </a:graphic>
+          </wp:inline>
+        </w:drawing>
+      </w:r>
+    </w:p>
+    <w:p>
+      <w:pPr>
+        <w:jc w:val="center"/>
+      </w:pPr>
+      <w:r>
+        <w:rPr>
+          <w:i/>
+          <w:sz w:val="18"/>
+        </w:rPr>
+        <w:t>Figura 1 - Representacao ilustrativa do painel do Registro.br (DNS + DNSSEC).</w:t>
+      </w:r>
+    </w:p>
+    <w:p>
+      <w:pPr>
+        <w:pStyle w:val="Heading2"/>
+      </w:pPr>
+      <w:r>
+        <w:t>A.4. Pre-requisitos antes de comecar</w:t>
+      </w:r>
+    </w:p>
+    <w:p>
+      <w:pPr>
+        <w:pStyle w:val="ListBullet"/>
+      </w:pPr>
+      <w:r>
+        <w:t>Login do titular (ou conta com permissao de administracao) no registro.br.</w:t>
+      </w:r>
+    </w:p>
+    <w:p>
+      <w:pPr>
+        <w:pStyle w:val="ListBullet"/>
+      </w:pPr>
+      <w:r>
+        <w:t>Bloco "Provedor de Servicos" como "Nenhum" (senao as opcoes ficam bloqueadas).</w:t>
+      </w:r>
+    </w:p>
+    <w:p>
+      <w:pPr>
+        <w:pStyle w:val="ListBullet"/>
+      </w:pPr>
+      <w:r>
+        <w:t>Executar em horario de baixo trafego.</w:t>
+      </w:r>
+    </w:p>
+    <w:p>
+      <w:pPr>
+        <w:pStyle w:val="Heading2"/>
+      </w:pPr>
+      <w:r>
+        <w:t>A.5. Passo a passo</w:t>
+      </w:r>
+    </w:p>
+    <w:p>
+      <w:pPr>
+        <w:pStyle w:val="ListNumber"/>
+      </w:pPr>
+      <w:r>
+        <w:t>Acesse registro.br &gt; Acessar Conta e faca login.</w:t>
+      </w:r>
+    </w:p>
+    <w:p>
+      <w:pPr>
+        <w:pStyle w:val="ListNumber"/>
+      </w:pPr>
+      <w:r>
+        <w:t>Aba Dominios &gt; selecione holambra.com.br.</w:t>
+      </w:r>
+    </w:p>
+    <w:p>
+      <w:pPr>
+        <w:pStyle w:val="ListNumber"/>
+      </w:pPr>
+      <w:r>
+        <w:t>Localize a area de DNS / DNSSEC (blocos: Dados do Titular, Contatos, DNS, Provedor de Servicos).</w:t>
+      </w:r>
+    </w:p>
+    <w:p>
+      <w:r>
+        <w:rPr>
+          <w:b/>
+        </w:rPr>
+        <w:t>Cenario A - DNS gerenciado pelo Registro.br (caso do holambra.com.br):</w:t>
+      </w:r>
+    </w:p>
+    <w:p>
+      <w:pPr>
+        <w:pStyle w:val="ListBullet"/>
+      </w:pPr>
+      <w:r>
+        <w:t>Localize a secao DNSSEC com o interruptor (toggle) "Habilitado/Ativo".</w:t>
+      </w:r>
+    </w:p>
+    <w:p>
+      <w:pPr>
+        <w:pStyle w:val="ListBullet"/>
+      </w:pPr>
+      <w:r>
+        <w:t>Desligue o toggle do DNSSEC.</w:t>
+      </w:r>
+    </w:p>
+    <w:p>
+      <w:pPr>
+        <w:pStyle w:val="ListBullet"/>
+      </w:pPr>
+      <w:r>
+        <w:t>Clique em Salvar alteracoes e confirme.</w:t>
+      </w:r>
+    </w:p>
+    <w:p>
+      <w:pPr>
+        <w:pStyle w:val="ListBullet"/>
+      </w:pPr>
+      <w:r>
+        <w:t>O Registro.br remove o DS do .br e des-assina a zona automaticamente, na ordem correta.</w:t>
+      </w:r>
+    </w:p>
+    <w:p>
+      <w:r>
+        <w:rPr>
+          <w:b/>
+        </w:rPr>
+        <w:t>Cenario B - entrada manual de DS (DNS externo):</w:t>
+      </w:r>
+    </w:p>
+    <w:p>
+      <w:pPr>
+        <w:pStyle w:val="ListBullet"/>
+      </w:pPr>
+      <w:r>
+        <w:t>Expanda "+DNSSEC".</w:t>
+      </w:r>
+    </w:p>
+    <w:p>
+      <w:pPr>
+        <w:pStyle w:val="ListBullet"/>
+      </w:pPr>
+      <w:r>
+        <w:t>Localize a linha do DS com Key Tag 9221, Algoritmo 13, Digest Type 2.</w:t>
+      </w:r>
+    </w:p>
+    <w:p>
+      <w:pPr>
+        <w:pStyle w:val="ListBullet"/>
+      </w:pPr>
+      <w:r>
+        <w:t>Clique no icone de remover/excluir (lixeira).</w:t>
+      </w:r>
+    </w:p>
+    <w:p>
+      <w:pPr>
+        <w:pStyle w:val="ListBullet"/>
+      </w:pPr>
+      <w:r>
+        <w:t>Salve e confirme a remocao.</w:t>
+      </w:r>
+    </w:p>
+    <w:p/>
+    <w:p>
+      <w:r>
+        <w:t>Em ambos os casos, o efeito final e o mesmo: o DS deixa de ser publicado na zona .br.</w:t>
+      </w:r>
+    </w:p>
+    <w:p>
+      <w:pPr>
+        <w:pStyle w:val="Heading2"/>
+      </w:pPr>
+      <w:r>
+        <w:t>A.6. Validacao</w:t>
+      </w:r>
+    </w:p>
+    <w:p>
+      <w:r>
+        <w:rPr>
+          <w:rFonts w:ascii="Consolas" w:hAnsi="Consolas"/>
+          <w:sz w:val="18"/>
+        </w:rPr>
+        <w:t>Resolve-DnsName -Name holambra.com.br -Type DS -Server 8.8.8.8</w:t>
+      </w:r>
+    </w:p>
+    <w:p>
+      <w:r>
+        <w:rPr>
+          <w:rFonts w:ascii="Consolas" w:hAnsi="Consolas"/>
+          <w:sz w:val="18"/>
+        </w:rPr>
+        <w:t>nslookup holambra.com.br 8.8.8.8</w:t>
+      </w:r>
+    </w:p>
+    <w:p>
+      <w:r>
+        <w:t>Navegador: https://dns.google/resolve?name=holambra.com.br&amp;type=DS (campo Answer deve sumir).</w:t>
+      </w:r>
+    </w:p>
+    <w:p>
+      <w:r>
+        <w:t>Navegador: https://dnsviz.net/d/holambra.com.br/dnssec/</w:t>
+      </w:r>
+    </w:p>
+    <w:p>
+      <w:r>
+        <w:br w:type="page"/>
+      </w:r>
+    </w:p>
+    <w:p>
+      <w:pPr>
+        <w:pStyle w:val="Heading1"/>
+      </w:pPr>
+      <w:r>
+        <w:t>ANEXO B - FAQ para o Cliente</w:t>
+      </w:r>
+    </w:p>
+    <w:p>
+      <w:r>
+        <w:rPr>
+          <w:b/>
+          <w:color w:val="003366"/>
+        </w:rPr>
+        <w:t>P: O site / e-mail vai cair durante esse processo?</w:t>
+      </w:r>
+    </w:p>
+    <w:p>
+      <w:pPr>
+        <w:spacing w:after="160"/>
+      </w:pPr>
+      <w:r>
+        <w:t>R: Nao, se feito na ordem certa. Remover o DNSSEC nao derruba a resolucao normal. Usuarios cujos provedores nao validam DNSSEC nem percebem; os que validam continuam resolvendo assim que o DS sai e o cache expira. O e-mail (Microsoft 365) e o site continuam funcionando - nenhum registro MX/A/CNAME e alterado nesta etapa.</w:t>
+      </w:r>
+    </w:p>
+    <w:p>
+      <w:r>
+        <w:rPr>
+          <w:b/>
+          <w:color w:val="003366"/>
+        </w:rPr>
+        <w:t>P: Por que precisamos desligar o DNSSEC? Nao fica menos seguro?</w:t>
+      </w:r>
+    </w:p>
+    <w:p>
+      <w:pPr>
+        <w:spacing w:after="160"/>
+      </w:pPr>
+      <w:r>
+        <w:t>R: E uma medida temporaria durante a migracao. Como a assinatura e feita pelas chaves do Registro.br e vamos passar o DNS para o Azure (que tera chaves proprias), manter o DS antigo quebraria a validacao. Reativamos o DNSSEC no Azure no final, restabelecendo a protecao.</w:t>
+      </w:r>
+    </w:p>
+    <w:p>
+      <w:r>
+        <w:rPr>
+          <w:b/>
+          <w:color w:val="003366"/>
+        </w:rPr>
+        <w:t>P: Quanto tempo demora?</w:t>
+      </w:r>
+    </w:p>
+    <w:p>
+      <w:pPr>
+        <w:spacing w:after="160"/>
+      </w:pPr>
+      <w:r>
+        <w:t>R: A acao no painel e imediata. A propagacao do DS leva de 2 a 6 horas. A migracao completa (com a troca de NS depois) pode levar ate 24-48h para propagar globalmente.</w:t>
+      </w:r>
+    </w:p>
+    <w:p>
+      <w:r>
+        <w:rPr>
+          <w:b/>
+          <w:color w:val="003366"/>
+        </w:rPr>
+        <w:t>P: Qual e o risco?</w:t>
+      </w:r>
+    </w:p>
+    <w:p>
+      <w:pPr>
+        <w:spacing w:after="160"/>
+      </w:pPr>
+      <w:r>
+        <w:t>R: O unico risco real e inverter a ordem (trocar os NS para o Azure antes de remover o DS). No nosso cenario, como o Registro.br gerencia tudo, ele ja faz na ordem certa ao desligar o toggle.</w:t>
+      </w:r>
+    </w:p>
+    <w:p>
+      <w:r>
+        <w:rPr>
+          <w:b/>
+          <w:color w:val="003366"/>
+        </w:rPr>
+        <w:t>P: Da para migrar mantendo o DNSSEC ligado?</w:t>
+      </w:r>
+    </w:p>
+    <w:p>
+      <w:pPr>
+        <w:spacing w:after="160"/>
+      </w:pPr>
+      <w:r>
+        <w:t>R: Tecnicamente existe um processo avancado de transferencia de chaves, mas e complexo e arriscado entre provedores diferentes. O caminho seguro e recomendado e: desligar, migrar, reativar no Azure.</w:t>
+      </w:r>
+    </w:p>
+    <w:p>
+      <w:r>
+        <w:rPr>
+          <w:b/>
+          <w:color w:val="003366"/>
+        </w:rPr>
+        <w:t>P: Conseguimos reverter se algo der errado?</w:t>
+      </w:r>
+    </w:p>
+    <w:p>
+      <w:pPr>
+        <w:spacing w:after="160"/>
+      </w:pPr>
+      <w:r>
+        <w:t>R: Sim. Enquanto os NS ainda apontarem para o Registro.br, da para reativar o DNSSEC no proprio painel. Apos migrar para o Azure, a reativacao e feita la e o novo DS e cadastrado no Registro.br.</w:t>
+      </w:r>
+    </w:p>
+    <w:p>
+      <w:r>
+        <w:br w:type="page"/>
+      </w:r>
+    </w:p>
+    <w:p>
+      <w:pPr>
+        <w:pStyle w:val="Heading1"/>
+      </w:pPr>
+      <w:r>
+        <w:t>ANEXO C - Checklist de Preparacao</w:t>
+      </w:r>
+    </w:p>
+    <w:p>
+      <w:pPr>
+        <w:pStyle w:val="ListBullet"/>
+      </w:pPr>
+      <w:r>
+        <w:t>[  ] Acesso ao painel do Registro.br confirmado (titular/admin)</w:t>
+      </w:r>
+    </w:p>
+    <w:p>
+      <w:pPr>
+        <w:pStyle w:val="ListBullet"/>
+      </w:pPr>
+      <w:r>
+        <w:t>[  ] Provedor de Servicos = Nenhum (senao, desbloquear antes)</w:t>
+      </w:r>
+    </w:p>
+    <w:p>
+      <w:pPr>
+        <w:pStyle w:val="ListBullet"/>
+      </w:pPr>
+      <w:r>
+        <w:t>[  ] Janela de baixo trafego combinada com o cliente</w:t>
+      </w:r>
+    </w:p>
+    <w:p>
+      <w:pPr>
+        <w:pStyle w:val="ListBullet"/>
+      </w:pPr>
+      <w:r>
+        <w:t>[  ] Print/anotacao do estado atual do DNSSEC (Key Tag 9221, Algoritmo 13)</w:t>
+      </w:r>
+    </w:p>
+    <w:p>
+      <w:pPr>
+        <w:pStyle w:val="ListBullet"/>
+      </w:pPr>
+      <w:r>
+        <w:t>[  ] Comandos de validacao prontos</w:t>
+      </w:r>
+    </w:p>
+    <w:p>
+      <w:pPr>
+        <w:pStyle w:val="ListBullet"/>
+      </w:pPr>
+      <w:r>
+        <w:t>[  ] Zona ja criada no Azure DNS com todos os registros (antes da troca de NS)</w:t>
+      </w:r>
+    </w:p>
+    <w:p>
+      <w:pPr>
+        <w:pStyle w:val="ListBullet"/>
+      </w:pPr>
+      <w:r>
+        <w:t>[  ] Combinado com o cliente o tempo de espera (2-6h) antes da troca de NS</w:t>
+      </w:r>
+    </w:p>
     <w:sectPr>
       <w:pgSz w:w="12240" w:h="15840"/>
       <w:pgMar w:top="1440" w:right="1800" w:bottom="1440" w:left="1800" w:header="720" w:footer="720" w:gutter="0"/>

</xml_diff>

<commit_message>
Update Holambra - Plano DNS rev3 (DNS hospedado: DNSSEC automatico sem toggle, removido na troca de NS)
</commit_message>
<xml_diff>
--- a/Holambra/Plano_Migracao_DNS_Holambra_Azure.docx
+++ b/Holambra/Plano_Migracao_DNS_Holambra_Azure.docx
@@ -84,7 +84,79 @@
           <w:color w:val="787878"/>
           <w:sz w:val="20"/>
         </w:rPr>
-        <w:t>Revisao 2 - inclui guia detalhado de DNSSEC e FAQ</w:t>
+        <w:t>Revisao 3 - DNS hospedado no Registro.br: DNSSEC automatico (sem toggle)</w:t>
+      </w:r>
+    </w:p>
+    <w:p>
+      <w:r>
+        <w:br w:type="page"/>
+      </w:r>
+    </w:p>
+    <w:p>
+      <w:pPr>
+        <w:pStyle w:val="Heading1"/>
+      </w:pPr>
+      <w:r>
+        <w:t>Aviso Importante - Leia Antes de Executar</w:t>
+      </w:r>
+    </w:p>
+    <w:p>
+      <w:r>
+        <w:rPr>
+          <w:b/>
+          <w:color w:val="CC0000"/>
+        </w:rPr>
+        <w:t xml:space="preserve">DNS HOSPEDADO NO REGISTRO.BR: </w:t>
+      </w:r>
+      <w:r>
+        <w:t>Os nameservers atuais do dominio (b.sec.dns.br e c.sec.dns.br) sao do servico de DNS hospedado do proprio Registro.br. Esse servico assina a zona com DNSSEC de forma AUTOMATICA e OBRIGATORIA. Por isso, NAO existe um botao/toggle para desabilitar o DNSSEC no painel enquanto o dominio usar o DNS do Registro.br.</w:t>
+      </w:r>
+    </w:p>
+    <w:p/>
+    <w:p>
+      <w:r>
+        <w:t>Consequencia pratica: o DNSSEC so e removido quando o dominio deixa de usar o DNS do Registro.br e passa a usar servidores externos (Azure). Ou seja, a "desativacao do DNSSEC" acontece JUNTO com a troca de nameservers (FASE 3), e nao como uma etapa separada anterior.</w:t>
+      </w:r>
+    </w:p>
+    <w:p/>
+    <w:p>
+      <w:r>
+        <w:rPr>
+          <w:b/>
+        </w:rPr>
+        <w:t>Portanto, para este dominio:</w:t>
+      </w:r>
+    </w:p>
+    <w:p>
+      <w:pPr>
+        <w:pStyle w:val="ListBullet"/>
+      </w:pPr>
+      <w:r>
+        <w:t>A zona no Azure DNS precisa estar 100% pronta (todos os registros) ANTES de mexer no Registro.br.</w:t>
+      </w:r>
+    </w:p>
+    <w:p>
+      <w:pPr>
+        <w:pStyle w:val="ListBullet"/>
+      </w:pPr>
+      <w:r>
+        <w:t>Ao trocar os NS para o Azure, o Registro.br exibe um aviso de que o DNSSEC sera desativado e remove o DS automaticamente.</w:t>
+      </w:r>
+    </w:p>
+    <w:p>
+      <w:pPr>
+        <w:pStyle w:val="ListBullet"/>
+      </w:pPr>
+      <w:r>
+        <w:t>Pode haver uma janela curta (ate ~1h, TTL do DS) de possivel SERVFAIL para resolvedores que validam DNSSEC. Faca em horario de baixo trafego.</w:t>
+      </w:r>
+    </w:p>
+    <w:p>
+      <w:pPr>
+        <w:pStyle w:val="ListBullet"/>
+      </w:pPr>
+      <w:r>
+        <w:t>A remocao manual de DS (Key Tag/Digest) so se aplica a dominios que usam DNS EXTERNO - nao e o caso atual.</w:t>
       </w:r>
     </w:p>
     <w:p>
@@ -113,7 +185,7 @@
         <w:spacing w:after="40" w:before="40"/>
       </w:pPr>
       <w:r>
-        <w:t>2. FASE 1 - Desabilitar DNSSEC no Registro.br</w:t>
+        <w:t>2. FASE 1 - DNSSEC no Registro.br (cenarios)</w:t>
       </w:r>
     </w:p>
     <w:p>
@@ -129,7 +201,7 @@
         <w:spacing w:after="40" w:before="40"/>
       </w:pPr>
       <w:r>
-        <w:t>4. FASE 3 - Apontar os Nameservers no Registro.br</w:t>
+        <w:t>4. FASE 3 - Apontar os Nameservers (remove o DNSSEC automaticamente)</w:t>
       </w:r>
     </w:p>
     <w:p>
@@ -161,7 +233,7 @@
         <w:spacing w:after="40" w:before="40"/>
       </w:pPr>
       <w:r>
-        <w:t>ANEXO A - Guia Detalhado: Como Desabilitar o DNSSEC no Registro.br</w:t>
+        <w:t>ANEXO A - Guia Detalhado: DNSSEC no Registro.br (DNS hospedado x externo)</w:t>
       </w:r>
     </w:p>
     <w:p>
@@ -198,7 +270,7 @@
         <w:pStyle w:val="Heading2"/>
       </w:pPr>
       <w:r>
-        <w:t>1.1. Nameservers (Registro.br gerenciado)</w:t>
+        <w:t>1.1. Nameservers (DNS hospedado pelo Registro.br)</w:t>
       </w:r>
     </w:p>
     <w:p>
@@ -229,12 +301,12 @@
       <w:r>
         <w:rPr>
           <w:b/>
-          <w:color w:val="006600"/>
+          <w:color w:val="CC0000"/>
         </w:rPr>
         <w:t xml:space="preserve">IMPORTANTE: </w:t>
       </w:r>
       <w:r>
-        <w:t>Os nameservers atuais sao do proprio Registro.br (servico de DNS hospedado). Isso significa que o Registro.br hospeda a zona E gerencia o DNSSEC automaticamente. Na pratica, desabilitar o DNSSEC sera apenas desligar um botao (toggle), e o Registro.br remove o DS e des-assina a zona na ordem correta automaticamente. Veja o ANEXO A.</w:t>
+        <w:t>Os servidores sec.dns.br sao o DNS hospedado do Registro.br, que assina a zona com DNSSEC automaticamente. Nao ha como desabilitar o DNSSEC separadamente; ele e removido ao migrar para servidores externos (Azure). Veja o Aviso Importante e o ANEXO A.</w:t>
       </w:r>
     </w:p>
     <w:p>
@@ -242,7 +314,7 @@
         <w:pStyle w:val="Heading2"/>
       </w:pPr>
       <w:r>
-        <w:t>1.2. DNSSEC - ATIVO (confirmado)</w:t>
+        <w:t>1.2. DNSSEC - ATIVO (confirmado, automatico)</w:t>
       </w:r>
     </w:p>
     <w:tbl>
@@ -317,7 +389,7 @@
           </w:tcPr>
           <w:p>
             <w:r>
-              <w:t>13 (ECDSAP256SHA256) - KSK ativo</w:t>
+              <w:t>13 (ECDSAP256SHA256) - assinatura automatica do Registro.br</w:t>
             </w:r>
           </w:p>
         </w:tc>
@@ -373,7 +445,7 @@
           </w:tcPr>
           <w:p>
             <w:r>
-              <w:t>DNSKEY</w:t>
+              <w:t>Gerenciamento</w:t>
             </w:r>
           </w:p>
         </w:tc>
@@ -383,7 +455,7 @@
           </w:tcPr>
           <w:p>
             <w:r>
-              <w:t>257 3 13 Ydr7nGBdivTQLbSZ3pXeFRDImbncIAazYMGJokteKOUONBhbtgPY971wNVTIThb5hABElmigmSRSC/4rVQ6yhA==</w:t>
+              <w:t>Automatico pelo Registro.br (DNS hospedado) - sem toggle de desativacao</w:t>
             </w:r>
           </w:p>
         </w:tc>
@@ -813,18 +885,19 @@
         <w:pStyle w:val="Heading1"/>
       </w:pPr>
       <w:r>
-        <w:t>2. FASE 1 - Desabilitar DNSSEC no Registro.br</w:t>
+        <w:t>2. FASE 1 - DNSSEC no Registro.br (cenarios)</w:t>
       </w:r>
     </w:p>
     <w:p>
       <w:r>
         <w:rPr>
           <w:b/>
+          <w:color w:val="CC0000"/>
         </w:rPr>
-        <w:t xml:space="preserve">Resumo: </w:t>
+        <w:t xml:space="preserve">Para o holambra.com.br (DNS hospedado): </w:t>
       </w:r>
       <w:r>
-        <w:t>Esta fase remove a protecao DNSSEC para permitir a futura troca de nameservers para o Azure. Para o passo a passo completo, com telas e os dois cenarios possiveis, consulte o ANEXO A.</w:t>
+        <w:t>NAO ha opcao de desabilitar o DNSSEC separadamente. A remocao ocorre automaticamente ao trocar os nameservers para o Azure (FASE 3). Os passos de remocao manual de DS abaixo (Cenario B) aplicam-se apenas a dominios com DNS EXTERNO.</w:t>
       </w:r>
     </w:p>
     <w:p>
@@ -832,7 +905,12 @@
         <w:pStyle w:val="Heading2"/>
       </w:pPr>
       <w:r>
-        <w:t>Passo 1.1 - Acessar o painel do Registro.br</w:t>
+        <w:t>Cenario A - DNS hospedado pelo Registro.br (CASO DO HOLAMBRA)</w:t>
+      </w:r>
+    </w:p>
+    <w:p>
+      <w:r>
+        <w:t>O DNSSEC e automatico e nao possui botao de desativacao. O que fazer:</w:t>
       </w:r>
     </w:p>
     <w:p>
@@ -840,7 +918,7 @@
         <w:pStyle w:val="ListNumber"/>
       </w:pPr>
       <w:r>
-        <w:t>Acesse https://registro.br e faca login com as credenciais do titular do dominio.</w:t>
+        <w:t>NAO procure por um toggle de DNSSEC - ele nao existe neste modo.</w:t>
       </w:r>
     </w:p>
     <w:p>
@@ -848,7 +926,23 @@
         <w:pStyle w:val="ListNumber"/>
       </w:pPr>
       <w:r>
-        <w:t>No painel, localize e clique no dominio holambra.com.br.</w:t>
+        <w:t>Garanta que a zona no Azure DNS esteja 100% pronta (FASE 2) ANTES de prosseguir.</w:t>
+      </w:r>
+    </w:p>
+    <w:p>
+      <w:pPr>
+        <w:pStyle w:val="ListNumber"/>
+      </w:pPr>
+      <w:r>
+        <w:t>A "desativacao" do DNSSEC acontecera na FASE 3, ao trocar os nameservers para o Azure (o Registro.br avisa e remove o DS automaticamente).</w:t>
+      </w:r>
+    </w:p>
+    <w:p>
+      <w:pPr>
+        <w:pStyle w:val="ListNumber"/>
+      </w:pPr>
+      <w:r>
+        <w:t>Apos a troca, valide imediatamente que o DS foi removido (comando no Passo 1.4 / FASE 3).</w:t>
       </w:r>
     </w:p>
     <w:p>
@@ -856,15 +950,12 @@
         <w:pStyle w:val="Heading2"/>
       </w:pPr>
       <w:r>
-        <w:t>Passo 1.2 - Desabilitar o DNSSEC / Remover o registro DS</w:t>
+        <w:t>Cenario B - DNS externo (apenas referencia)</w:t>
       </w:r>
     </w:p>
     <w:p>
       <w:r>
-        <w:rPr>
-          <w:b/>
-        </w:rPr>
-        <w:t>Cenario A (caso do holambra.com.br - DNS gerenciado pelo Registro.br):</w:t>
+        <w:t>Se o dominio usasse servidores DNS externos, a remocao seria manual:</w:t>
       </w:r>
     </w:p>
     <w:p>
@@ -872,39 +963,7 @@
         <w:pStyle w:val="ListNumber"/>
       </w:pPr>
       <w:r>
-        <w:t>Localize a secao DNSSEC e desligue o toggle "Habilitado".</w:t>
-      </w:r>
-    </w:p>
-    <w:p>
-      <w:pPr>
-        <w:pStyle w:val="ListNumber"/>
-      </w:pPr>
-      <w:r>
-        <w:t>Clique em Salvar alteracoes e confirme.</w:t>
-      </w:r>
-    </w:p>
-    <w:p>
-      <w:pPr>
-        <w:pStyle w:val="ListNumber"/>
-      </w:pPr>
-      <w:r>
-        <w:t>O Registro.br remove o DS do .br e des-assina a zona automaticamente.</w:t>
-      </w:r>
-    </w:p>
-    <w:p>
-      <w:r>
-        <w:rPr>
-          <w:b/>
-        </w:rPr>
-        <w:t>Cenario B (se a tela mostrar entrada manual de DS - DNS externo):</w:t>
-      </w:r>
-    </w:p>
-    <w:p>
-      <w:pPr>
-        <w:pStyle w:val="ListNumber"/>
-      </w:pPr>
-      <w:r>
-        <w:t>Expanda "+DNSSEC".</w:t>
+        <w:t>Acesse o dominio &gt; secao DNS &gt; expanda "+DNSSEC".</w:t>
       </w:r>
     </w:p>
     <w:p>
@@ -924,6 +983,14 @@
       </w:r>
     </w:p>
     <w:p>
+      <w:pPr>
+        <w:pStyle w:val="ListNumber"/>
+      </w:pPr>
+      <w:r>
+        <w:t>Aguarde o TTL do DS (1h) antes de des-assinar a zona no provedor externo.</w:t>
+      </w:r>
+    </w:p>
+    <w:p>
       <w:r>
         <w:rPr>
           <w:b/>
@@ -932,7 +999,7 @@
         <w:t xml:space="preserve">ATENCAO CRITICA: </w:t>
       </w:r>
       <w:r>
-        <w:t>Nunca troque os nameservers para o Azure antes de remover o DS e aguardar o TTL. Se inverter a ordem, a cadeia DNSSEC quebra e causa SERVFAIL (dominio fora do ar para resolvedores que validam).</w:t>
+        <w:t>Em qualquer cenario, a regra de ouro e: o DS na zona pai (.br) precisa sair antes/junto da zona deixar de ser assinada. Inverter a ordem causa SERVFAIL.</w:t>
       </w:r>
     </w:p>
     <w:p>
@@ -940,31 +1007,7 @@
         <w:pStyle w:val="Heading2"/>
       </w:pPr>
       <w:r>
-        <w:t>Passo 1.3 - Aguardar propagacao do TTL do DS</w:t>
-      </w:r>
-    </w:p>
-    <w:p>
-      <w:pPr>
-        <w:pStyle w:val="ListBullet"/>
-      </w:pPr>
-      <w:r>
-        <w:t>O TTL do DS record e de 3600 segundos (1 hora).</w:t>
-      </w:r>
-    </w:p>
-    <w:p>
-      <w:pPr>
-        <w:pStyle w:val="ListBullet"/>
-      </w:pPr>
-      <w:r>
-        <w:t>Aguarde no minimo 2 horas (recomendado 4-6 horas) apos a remocao.</w:t>
-      </w:r>
-    </w:p>
-    <w:p>
-      <w:pPr>
-        <w:pStyle w:val="Heading2"/>
-      </w:pPr>
-      <w:r>
-        <w:t>Passo 1.4 - Validar a remocao do DS</w:t>
+        <w:t>Passo 1.4 - Validar a remocao do DS (apos a troca de NS)</w:t>
       </w:r>
     </w:p>
     <w:p>
@@ -978,29 +1021,12 @@
     </w:p>
     <w:p>
       <w:r>
-        <w:t>O campo Answer deve estar ausente ou vazio.</w:t>
-      </w:r>
-    </w:p>
-    <w:p>
-      <w:r>
-        <w:rPr>
-          <w:rFonts w:ascii="Consolas" w:hAnsi="Consolas"/>
-          <w:sz w:val="18"/>
-        </w:rPr>
-        <w:t>nslookup holambra.com.br 8.8.8.8</w:t>
+        <w:t>O campo Answer deve estar ausente ou vazio (DS removido).</w:t>
       </w:r>
     </w:p>
     <w:p>
       <w:r>
         <w:t>Validar tambem em: https://dnsviz.net/d/holambra.com.br/dnssec/</w:t>
-      </w:r>
-    </w:p>
-    <w:p>
-      <w:r>
-        <w:rPr>
-          <w:b/>
-        </w:rPr>
-        <w:t>So prossiga para a Fase 2 quando o DS for confirmado como removido.</w:t>
       </w:r>
     </w:p>
     <w:p>
@@ -1014,6 +1040,18 @@
       </w:pPr>
       <w:r>
         <w:t>3. FASE 2 - Criar a Zona DNS no Azure</w:t>
+      </w:r>
+    </w:p>
+    <w:p>
+      <w:r>
+        <w:rPr>
+          <w:b/>
+          <w:color w:val="000000"/>
+        </w:rPr>
+        <w:t xml:space="preserve">Pre-requisito critico: </w:t>
+      </w:r>
+      <w:r>
+        <w:t>Para o holambra.com.br, esta fase deve ser concluida e validada ANTES de trocar os nameservers, pois a troca de NS (FASE 3) remove o DNSSEC e ativa o Azure de uma so vez.</w:t>
       </w:r>
     </w:p>
     <w:p>
@@ -1284,7 +1322,19 @@
         <w:pStyle w:val="Heading1"/>
       </w:pPr>
       <w:r>
-        <w:t>4. FASE 3 - Apontar os Nameservers no Registro.br</w:t>
+        <w:t>4. FASE 3 - Apontar os Nameservers (remove o DNSSEC automaticamente)</w:t>
+      </w:r>
+    </w:p>
+    <w:p>
+      <w:r>
+        <w:rPr>
+          <w:b/>
+          <w:color w:val="CC0000"/>
+        </w:rPr>
+        <w:t xml:space="preserve">Esta e a etapa que efetivamente remove o DNSSEC para o holambra.com.br. </w:t>
+      </w:r>
+      <w:r>
+        <w:t>Ao trocar os NS de sec.dns.br para o Azure, o Registro.br para de assinar a zona e remove o DS.</w:t>
       </w:r>
     </w:p>
     <w:p>
@@ -1300,7 +1350,7 @@
         <w:pStyle w:val="ListNumber"/>
       </w:pPr>
       <w:r>
-        <w:t>Acesse o dominio &gt; secao DNS &gt; Alterar Servidores DNS.</w:t>
+        <w:t>Acesse o dominio &gt; secao DNS / Configuracao de DNS.</w:t>
       </w:r>
     </w:p>
     <w:p>
@@ -1308,7 +1358,7 @@
         <w:pStyle w:val="ListNumber"/>
       </w:pPr>
       <w:r>
-        <w:t>Remova b.sec.dns.br e c.sec.dns.br.</w:t>
+        <w:t>Se houver "Provedor de Servicos" vinculado, defina como "Nenhum" (senao as opcoes ficam bloqueadas).</w:t>
       </w:r>
     </w:p>
     <w:p>
@@ -1316,7 +1366,7 @@
         <w:pStyle w:val="ListNumber"/>
       </w:pPr>
       <w:r>
-        <w:t>Adicione os 4 nameservers do Azure (Passo 2.2).</w:t>
+        <w:t>Clique em "Alterar Servidores DNS" / informar outros servidores.</w:t>
       </w:r>
     </w:p>
     <w:p>
@@ -1324,19 +1374,15 @@
         <w:pStyle w:val="ListNumber"/>
       </w:pPr>
       <w:r>
-        <w:t>Salve as alteracoes.</w:t>
+        <w:t>Remova b.sec.dns.br e c.sec.dns.br e adicione os 4 nameservers do Azure (Passo 2.2).</w:t>
       </w:r>
     </w:p>
     <w:p>
+      <w:pPr>
+        <w:pStyle w:val="ListNumber"/>
+      </w:pPr>
       <w:r>
-        <w:rPr>
-          <w:b/>
-          <w:color w:val="000000"/>
-        </w:rPr>
-        <w:t xml:space="preserve">Nota: </w:t>
-      </w:r>
-      <w:r>
-        <w:t>Para alterar DNS, o Provedor de Servicos deve estar como "Nenhum". Se houver provedor vinculado, desvincule antes.</w:t>
+        <w:t>Ao salvar, o Registro.br exibira um aviso de que o DNSSEC sera desativado - confirme.</w:t>
       </w:r>
     </w:p>
     <w:p>
@@ -1348,11 +1394,37 @@
       </w:r>
     </w:p>
     <w:p>
+      <w:r>
+        <w:t>A troca de NS propaga em 2 a 48h. A remocao do DS propaga conforme o TTL (ate ~1h).</w:t>
+      </w:r>
+    </w:p>
+    <w:p>
+      <w:r>
+        <w:rPr>
+          <w:b/>
+          <w:color w:val="000000"/>
+        </w:rPr>
+        <w:t xml:space="preserve">Janela de risco: </w:t>
+      </w:r>
+      <w:r>
+        <w:t>Como nao e possivel remover o DS antes (DNS hospedado), pode haver ate ~1h em que alguns resolvedores que validam DNSSEC retornem SERVFAIL. Execute em horario de baixo trafego.</w:t>
+      </w:r>
+    </w:p>
+    <w:p>
       <w:pPr>
         <w:pStyle w:val="Heading2"/>
       </w:pPr>
       <w:r>
-        <w:t>Passo 3.3 - Validar a migracao</w:t>
+        <w:t>Passo 3.3 - Validar a migracao e a remocao do DS</w:t>
+      </w:r>
+    </w:p>
+    <w:p>
+      <w:r>
+        <w:rPr>
+          <w:rFonts w:ascii="Consolas" w:hAnsi="Consolas"/>
+          <w:sz w:val="18"/>
+        </w:rPr>
+        <w:t>Resolve-DnsName -Name holambra.com.br -Type DS -Server 8.8.8.8   # deve vir vazio</w:t>
       </w:r>
     </w:p>
     <w:p>
@@ -1388,6 +1460,18 @@
       </w:pPr>
       <w:r>
         <w:t>Testar envio/recebimento de e-mail e acesso ao site www.holambra.com.br.</w:t>
+      </w:r>
+    </w:p>
+    <w:p>
+      <w:r>
+        <w:rPr>
+          <w:b/>
+          <w:color w:val="000000"/>
+        </w:rPr>
+        <w:t xml:space="preserve">Rede de seguranca: </w:t>
+      </w:r>
+      <w:r>
+        <w:t>Se o DS NAO for removido automaticamente, abra um chamado no Registro.br pedindo a remocao do DS, ou reverta temporariamente os NS para sec.dns.br.</w:t>
       </w:r>
     </w:p>
     <w:p>
@@ -1438,7 +1522,7 @@
         <w:pStyle w:val="ListNumber"/>
       </w:pPr>
       <w:r>
-        <w:t>No Registro.br, adicione o novo DS via secao DNSSEC e aguarde 1-2h.</w:t>
+        <w:t>No Registro.br (agora com DNS externo), adicione o novo DS via secao DNSSEC e aguarde 1-2h.</w:t>
       </w:r>
     </w:p>
     <w:p>
@@ -1460,6 +1544,18 @@
       </w:pPr>
       <w:r>
         <w:t>6. Cronograma Sugerido</w:t>
+      </w:r>
+    </w:p>
+    <w:p>
+      <w:r>
+        <w:rPr>
+          <w:b/>
+          <w:color w:val="000000"/>
+        </w:rPr>
+        <w:t xml:space="preserve">Observacao: </w:t>
+      </w:r>
+      <w:r>
+        <w:t>Para o DNS hospedado, as antigas "Fase 1 (desabilitar DNSSEC)" e "Fase 3 (trocar NS)" acontecem em um unico momento (a troca de NS remove o DNSSEC).</w:t>
       </w:r>
     </w:p>
     <w:tbl>
@@ -1502,7 +1598,7 @@
           </w:tcPr>
           <w:p>
             <w:r>
-              <w:t>Dia 1 (horario de baixo trafego)</w:t>
+              <w:t>Dia 1</w:t>
             </w:r>
           </w:p>
         </w:tc>
@@ -1512,7 +1608,7 @@
           </w:tcPr>
           <w:p>
             <w:r>
-              <w:t>Fase 1 - Desabilitar DNSSEC no Registro.br</w:t>
+              <w:t>Fase 2 - Criar zona e TODOS os registros no Azure DNS e validar</w:t>
             </w:r>
           </w:p>
         </w:tc>
@@ -1524,7 +1620,7 @@
           </w:tcPr>
           <w:p>
             <w:r>
-              <w:t>Dia 1 (+4-6h)</w:t>
+              <w:t>Dia 2 (horario de baixo trafego)</w:t>
             </w:r>
           </w:p>
         </w:tc>
@@ -1534,7 +1630,7 @@
           </w:tcPr>
           <w:p>
             <w:r>
-              <w:t>Validar remocao do DS</w:t>
+              <w:t>Fase 3 - Trocar NS para Azure (remove o DNSSEC automaticamente)</w:t>
             </w:r>
           </w:p>
         </w:tc>
@@ -1546,7 +1642,7 @@
           </w:tcPr>
           <w:p>
             <w:r>
-              <w:t>Dia 1 ou 2</w:t>
+              <w:t>Dia 2 (logo apos)</w:t>
             </w:r>
           </w:p>
         </w:tc>
@@ -1556,7 +1652,7 @@
           </w:tcPr>
           <w:p>
             <w:r>
-              <w:t>Fase 2 - Criar zona e registros no Azure DNS</w:t>
+              <w:t>Validar remocao do DS e resolucao de todos os registros</w:t>
             </w:r>
           </w:p>
         </w:tc>
@@ -1568,7 +1664,7 @@
           </w:tcPr>
           <w:p>
             <w:r>
-              <w:t>Dia 2</w:t>
+              <w:t>Dia 2-4</w:t>
             </w:r>
           </w:p>
         </w:tc>
@@ -1578,7 +1674,7 @@
           </w:tcPr>
           <w:p>
             <w:r>
-              <w:t>Fase 3 - Apontar NS para Azure no Registro.br</w:t>
+              <w:t>Acompanhar propagacao global (ate 48h)</w:t>
             </w:r>
           </w:p>
         </w:tc>
@@ -1590,7 +1686,7 @@
           </w:tcPr>
           <w:p>
             <w:r>
-              <w:t>Dia 4-5</w:t>
+              <w:t>Dia 5+</w:t>
             </w:r>
           </w:p>
         </w:tc>
@@ -1600,29 +1696,7 @@
           </w:tcPr>
           <w:p>
             <w:r>
-              <w:t>Validacao completa da migracao</w:t>
-            </w:r>
-          </w:p>
-        </w:tc>
-      </w:tr>
-      <w:tr>
-        <w:tc>
-          <w:tcPr>
-            <w:tcW w:type="dxa" w:w="4320"/>
-          </w:tcPr>
-          <w:p>
-            <w:r>
-              <w:t>Dia 7+</w:t>
-            </w:r>
-          </w:p>
-        </w:tc>
-        <w:tc>
-          <w:tcPr>
-            <w:tcW w:type="dxa" w:w="4320"/>
-          </w:tcPr>
-          <w:p>
-            <w:r>
-              <w:t>Fase 4 - Reabilitar DNSSEC no Azure DNS</w:t>
+              <w:t>Fase 4 - Reabilitar DNSSEC no Azure DNS e cadastrar novo DS no Registro.br</w:t>
             </w:r>
           </w:p>
         </w:tc>
@@ -1681,7 +1755,7 @@
           </w:tcPr>
           <w:p>
             <w:r>
-              <w:t>Remover DS na ordem errada causa SERVFAIL</w:t>
+              <w:t>DS antigo permanecer apos a troca de NS (SERVFAIL)</w:t>
             </w:r>
           </w:p>
         </w:tc>
@@ -1691,7 +1765,7 @@
           </w:tcPr>
           <w:p>
             <w:r>
-              <w:t>SEMPRE remover DS primeiro, aguardar TTL, depois alterar NS.</w:t>
+              <w:t>Validar o DS logo apos a troca; se persistir, abrir chamado no Registro.br ou reverter NS para sec.dns.br.</w:t>
             </w:r>
           </w:p>
         </w:tc>
@@ -1703,7 +1777,7 @@
           </w:tcPr>
           <w:p>
             <w:r>
-              <w:t>Esquecer algum registro DNS na migracao</w:t>
+              <w:t>Janela de ~1h de SERVFAIL (TTL do DS) por nao poder remover o DS antes</w:t>
             </w:r>
           </w:p>
         </w:tc>
@@ -1713,7 +1787,29 @@
           </w:tcPr>
           <w:p>
             <w:r>
-              <w:t>Inventario completo documentado; validar contra NS do Azure antes de apontar.</w:t>
+              <w:t>Executar em horario de baixo trafego; comunicar o cliente sobre a janela.</w:t>
+            </w:r>
+          </w:p>
+        </w:tc>
+      </w:tr>
+      <w:tr>
+        <w:tc>
+          <w:tcPr>
+            <w:tcW w:type="dxa" w:w="4320"/>
+          </w:tcPr>
+          <w:p>
+            <w:r>
+              <w:t>Trocar NS antes da zona Azure estar pronta</w:t>
+            </w:r>
+          </w:p>
+        </w:tc>
+        <w:tc>
+          <w:tcPr>
+            <w:tcW w:type="dxa" w:w="4320"/>
+          </w:tcPr>
+          <w:p>
+            <w:r>
+              <w:t>Concluir e validar 100% da FASE 2 antes de qualquer alteracao no Registro.br.</w:t>
             </w:r>
           </w:p>
         </w:tc>
@@ -1735,7 +1831,7 @@
           </w:tcPr>
           <w:p>
             <w:r>
-              <w:t>Priorizar validacao de e-mail; testar envio/recebimento apos apontar NS.</w:t>
+              <w:t>Recriar e validar todos os registros no Azure; testar e-mail apos a troca.</w:t>
             </w:r>
           </w:p>
         </w:tc>
@@ -1773,7 +1869,7 @@
         <w:pStyle w:val="Heading1"/>
       </w:pPr>
       <w:r>
-        <w:t>ANEXO A - Guia Detalhado: Como Desabilitar o DNSSEC no Registro.br</w:t>
+        <w:t>ANEXO A - Guia Detalhado: DNSSEC no Registro.br (DNS hospedado x externo)</w:t>
       </w:r>
     </w:p>
     <w:p>
@@ -1916,12 +2012,129 @@
         <w:pStyle w:val="Heading2"/>
       </w:pPr>
       <w:r>
-        <w:t>A.2. Por que precisamos desligar antes de migrar</w:t>
+        <w:t>A.2. Os dois modos no Registro.br</w:t>
+      </w:r>
+    </w:p>
+    <w:tbl>
+      <w:tblPr>
+        <w:tblStyle w:val="LightGrid-Accent1"/>
+        <w:tblW w:type="auto" w:w="0"/>
+        <w:jc w:val="center"/>
+        <w:tblLook w:firstColumn="1" w:firstRow="1" w:lastColumn="0" w:lastRow="0" w:noHBand="0" w:noVBand="1" w:val="04A0"/>
+      </w:tblPr>
+      <w:tblGrid>
+        <w:gridCol w:w="2880"/>
+        <w:gridCol w:w="2880"/>
+        <w:gridCol w:w="2880"/>
+      </w:tblGrid>
+      <w:tr>
+        <w:tc>
+          <w:tcPr>
+            <w:tcW w:type="dxa" w:w="2880"/>
+          </w:tcPr>
+          <w:p>
+            <w:r>
+              <w:t>Modo</w:t>
+            </w:r>
+          </w:p>
+        </w:tc>
+        <w:tc>
+          <w:tcPr>
+            <w:tcW w:type="dxa" w:w="2880"/>
+          </w:tcPr>
+          <w:p>
+            <w:r>
+              <w:t>DNSSEC</w:t>
+            </w:r>
+          </w:p>
+        </w:tc>
+        <w:tc>
+          <w:tcPr>
+            <w:tcW w:type="dxa" w:w="2880"/>
+          </w:tcPr>
+          <w:p>
+            <w:r>
+              <w:t>Como desativar</w:t>
+            </w:r>
+          </w:p>
+        </w:tc>
+      </w:tr>
+      <w:tr>
+        <w:tc>
+          <w:tcPr>
+            <w:tcW w:type="dxa" w:w="2880"/>
+          </w:tcPr>
+          <w:p>
+            <w:r>
+              <w:t>DNS hospedado no Registro.br (sec.dns.br) - CASO DO HOLAMBRA</w:t>
+            </w:r>
+          </w:p>
+        </w:tc>
+        <w:tc>
+          <w:tcPr>
+            <w:tcW w:type="dxa" w:w="2880"/>
+          </w:tcPr>
+          <w:p>
+            <w:r>
+              <w:t>Automatico e obrigatorio. Sem toggle.</w:t>
+            </w:r>
+          </w:p>
+        </w:tc>
+        <w:tc>
+          <w:tcPr>
+            <w:tcW w:type="dxa" w:w="2880"/>
+          </w:tcPr>
+          <w:p>
+            <w:r>
+              <w:t>Somente migrando para DNS externo. A troca de NS remove o DS automaticamente.</w:t>
+            </w:r>
+          </w:p>
+        </w:tc>
+      </w:tr>
+      <w:tr>
+        <w:tc>
+          <w:tcPr>
+            <w:tcW w:type="dxa" w:w="2880"/>
+          </w:tcPr>
+          <w:p>
+            <w:r>
+              <w:t>DNS externo + DS manual no Registro.br</w:t>
+            </w:r>
+          </w:p>
+        </w:tc>
+        <w:tc>
+          <w:tcPr>
+            <w:tcW w:type="dxa" w:w="2880"/>
+          </w:tcPr>
+          <w:p>
+            <w:r>
+              <w:t>Voce cadastra o DS manualmente.</w:t>
+            </w:r>
+          </w:p>
+        </w:tc>
+        <w:tc>
+          <w:tcPr>
+            <w:tcW w:type="dxa" w:w="2880"/>
+          </w:tcPr>
+          <w:p>
+            <w:r>
+              <w:t>Remover o DS (Key Tag/Digest) no painel, aguardar TTL, depois des-assinar no provedor.</w:t>
+            </w:r>
+          </w:p>
+        </w:tc>
+      </w:tr>
+    </w:tbl>
+    <w:p>
+      <w:pPr>
+        <w:pStyle w:val="Heading2"/>
+      </w:pPr>
+      <w:r>
+        <w:t>A.3. Por que o holambra nao tem opcao de desabilitar</w:t>
       </w:r>
     </w:p>
     <w:p>
       <w:r>
-        <w:t>Hoje a zona e assinada pelas chaves do Registro.br. Ao mudar os nameservers para o Azure, a zona passa a ser servida pelo Azure, que nao possui essas chaves. Se o DS antigo continuar publicado no .br, a cadeia quebra (SERVFAIL). Por isso: desligar o DNSSEC primeiro, migrar depois e reativar o DNSSEC ja no Azure com chaves e DS novos.</w:t>
+        <w:t>Como o dominio usa o DNS hospedado do Registro.br (sec.dns.br), o DNSSEC e parte integrante do servico e e aplicado automaticamente. Nao ha um botao para desliga-lo isoladamente. O DNSSEC so deixa de existir quando o dominio passa a usar servidores DNS externos (Azure) - momento em que o Registro.br para de assinar a zona e remove o DS da zona pai .br.</w:t>
       </w:r>
     </w:p>
     <w:p>
@@ -1929,12 +2142,12 @@
         <w:pStyle w:val="Heading2"/>
       </w:pPr>
       <w:r>
-        <w:t>A.3. Tela do painel (ilustrativa)</w:t>
+        <w:t>A.4. Tela do painel (ilustrativa)</w:t>
       </w:r>
     </w:p>
     <w:p>
       <w:r>
-        <w:t>Abaixo, uma representacao ilustrativa de como o painel do dominio se apresenta. A imagem e ilustrativa - a tela real pode variar em layout, mas os elementos (bloco DNS, secao DNSSEC e Provedor de Servicos) sao os mesmos.</w:t>
+        <w:t>Representacao ilustrativa do painel do dominio. A imagem mostra a area de DNS e a indicacao de DNSSEC; no modo de DNS hospedado, nao havera um botao de desativacao - o DNSSEC sai ao trocar os servidores DNS.</w:t>
       </w:r>
     </w:p>
     <w:p>
@@ -1993,31 +2206,47 @@
         <w:pStyle w:val="Heading2"/>
       </w:pPr>
       <w:r>
-        <w:t>A.4. Pre-requisitos antes de comecar</w:t>
+        <w:t>A.5. Procedimento recomendado (DNS hospedado)</w:t>
       </w:r>
     </w:p>
     <w:p>
       <w:pPr>
-        <w:pStyle w:val="ListBullet"/>
+        <w:pStyle w:val="ListNumber"/>
       </w:pPr>
       <w:r>
-        <w:t>Login do titular (ou conta com permissao de administracao) no registro.br.</w:t>
+        <w:t>Concluir e validar 100% da zona no Azure DNS (FASE 2).</w:t>
       </w:r>
     </w:p>
     <w:p>
       <w:pPr>
-        <w:pStyle w:val="ListBullet"/>
+        <w:pStyle w:val="ListNumber"/>
       </w:pPr>
       <w:r>
-        <w:t>Bloco "Provedor de Servicos" como "Nenhum" (senao as opcoes ficam bloqueadas).</w:t>
+        <w:t>No Registro.br, definir Provedor de Servicos = Nenhum (se aplicavel).</w:t>
       </w:r>
     </w:p>
     <w:p>
       <w:pPr>
-        <w:pStyle w:val="ListBullet"/>
+        <w:pStyle w:val="ListNumber"/>
       </w:pPr>
       <w:r>
-        <w:t>Executar em horario de baixo trafego.</w:t>
+        <w:t>Trocar os nameservers para os do Azure e confirmar o aviso de desativacao do DNSSEC.</w:t>
+      </w:r>
+    </w:p>
+    <w:p>
+      <w:pPr>
+        <w:pStyle w:val="ListNumber"/>
+      </w:pPr>
+      <w:r>
+        <w:t>Validar imediatamente que o DS foi removido e que todos os registros resolvem.</w:t>
+      </w:r>
+    </w:p>
+    <w:p>
+      <w:pPr>
+        <w:pStyle w:val="ListNumber"/>
+      </w:pPr>
+      <w:r>
+        <w:t>Se o DS persistir, abrir chamado no Registro.br ou reverter os NS temporariamente.</w:t>
       </w:r>
     </w:p>
     <w:p>
@@ -2025,117 +2254,12 @@
         <w:pStyle w:val="Heading2"/>
       </w:pPr>
       <w:r>
-        <w:t>A.5. Passo a passo</w:t>
-      </w:r>
-    </w:p>
-    <w:p>
-      <w:pPr>
-        <w:pStyle w:val="ListNumber"/>
-      </w:pPr>
-      <w:r>
-        <w:t>Acesse registro.br &gt; Acessar Conta e faca login.</w:t>
-      </w:r>
-    </w:p>
-    <w:p>
-      <w:pPr>
-        <w:pStyle w:val="ListNumber"/>
-      </w:pPr>
-      <w:r>
-        <w:t>Aba Dominios &gt; selecione holambra.com.br.</w:t>
-      </w:r>
-    </w:p>
-    <w:p>
-      <w:pPr>
-        <w:pStyle w:val="ListNumber"/>
-      </w:pPr>
-      <w:r>
-        <w:t>Localize a area de DNS / DNSSEC (blocos: Dados do Titular, Contatos, DNS, Provedor de Servicos).</w:t>
+        <w:t>A.6. Alternativa conservadora</w:t>
       </w:r>
     </w:p>
     <w:p>
       <w:r>
-        <w:rPr>
-          <w:b/>
-        </w:rPr>
-        <w:t>Cenario A - DNS gerenciado pelo Registro.br (caso do holambra.com.br):</w:t>
-      </w:r>
-    </w:p>
-    <w:p>
-      <w:pPr>
-        <w:pStyle w:val="ListBullet"/>
-      </w:pPr>
-      <w:r>
-        <w:t>Localize a secao DNSSEC com o interruptor (toggle) "Habilitado/Ativo".</w:t>
-      </w:r>
-    </w:p>
-    <w:p>
-      <w:pPr>
-        <w:pStyle w:val="ListBullet"/>
-      </w:pPr>
-      <w:r>
-        <w:t>Desligue o toggle do DNSSEC.</w:t>
-      </w:r>
-    </w:p>
-    <w:p>
-      <w:pPr>
-        <w:pStyle w:val="ListBullet"/>
-      </w:pPr>
-      <w:r>
-        <w:t>Clique em Salvar alteracoes e confirme.</w:t>
-      </w:r>
-    </w:p>
-    <w:p>
-      <w:pPr>
-        <w:pStyle w:val="ListBullet"/>
-      </w:pPr>
-      <w:r>
-        <w:t>O Registro.br remove o DS do .br e des-assina a zona automaticamente, na ordem correta.</w:t>
-      </w:r>
-    </w:p>
-    <w:p>
-      <w:r>
-        <w:rPr>
-          <w:b/>
-        </w:rPr>
-        <w:t>Cenario B - entrada manual de DS (DNS externo):</w:t>
-      </w:r>
-    </w:p>
-    <w:p>
-      <w:pPr>
-        <w:pStyle w:val="ListBullet"/>
-      </w:pPr>
-      <w:r>
-        <w:t>Expanda "+DNSSEC".</w:t>
-      </w:r>
-    </w:p>
-    <w:p>
-      <w:pPr>
-        <w:pStyle w:val="ListBullet"/>
-      </w:pPr>
-      <w:r>
-        <w:t>Localize a linha do DS com Key Tag 9221, Algoritmo 13, Digest Type 2.</w:t>
-      </w:r>
-    </w:p>
-    <w:p>
-      <w:pPr>
-        <w:pStyle w:val="ListBullet"/>
-      </w:pPr>
-      <w:r>
-        <w:t>Clique no icone de remover/excluir (lixeira).</w:t>
-      </w:r>
-    </w:p>
-    <w:p>
-      <w:pPr>
-        <w:pStyle w:val="ListBullet"/>
-      </w:pPr>
-      <w:r>
-        <w:t>Salve e confirme a remocao.</w:t>
-      </w:r>
-    </w:p>
-    <w:p/>
-    <w:p>
-      <w:r>
-        <w:t>Em ambos os casos, o efeito final e o mesmo: o DS deixa de ser publicado na zona .br.</w:t>
+        <w:t>Antes de migrar, abrir um chamado/contato com o Registro.br (NIC.br) informando a intencao de migrar o dominio para servidores externos (Azure) e perguntar como desativar o DNSSEC com seguranca, para coordenar a remocao do DS e minimizar qualquer janela de SERVFAIL.</w:t>
       </w:r>
     </w:p>
     <w:p>
@@ -2143,7 +2267,7 @@
         <w:pStyle w:val="Heading2"/>
       </w:pPr>
       <w:r>
-        <w:t>A.6. Validacao</w:t>
+        <w:t>A.7. Validacao</w:t>
       </w:r>
     </w:p>
     <w:p>
@@ -2193,6 +2317,23 @@
           <w:b/>
           <w:color w:val="003366"/>
         </w:rPr>
+        <w:t>P: No painel nao aparece a opcao de desabilitar o DNSSEC. Esta errado?</w:t>
+      </w:r>
+    </w:p>
+    <w:p>
+      <w:pPr>
+        <w:spacing w:after="160"/>
+      </w:pPr>
+      <w:r>
+        <w:t>R: Nao. O dominio usa o DNS hospedado do Registro.br (sec.dns.br), que assina a zona automaticamente. Nesse modo nao existe um botao para desligar o DNSSEC. Ele e removido quando trocamos os servidores DNS para o Azure - a troca de NS ja remove o DS automaticamente.</w:t>
+      </w:r>
+    </w:p>
+    <w:p>
+      <w:r>
+        <w:rPr>
+          <w:b/>
+          <w:color w:val="003366"/>
+        </w:rPr>
         <w:t>P: O site / e-mail vai cair durante esse processo?</w:t>
       </w:r>
     </w:p>
@@ -2201,7 +2342,7 @@
         <w:spacing w:after="160"/>
       </w:pPr>
       <w:r>
-        <w:t>R: Nao, se feito na ordem certa. Remover o DNSSEC nao derruba a resolucao normal. Usuarios cujos provedores nao validam DNSSEC nem percebem; os que validam continuam resolvendo assim que o DS sai e o cache expira. O e-mail (Microsoft 365) e o site continuam funcionando - nenhum registro MX/A/CNAME e alterado nesta etapa.</w:t>
+        <w:t>R: O e-mail (Microsoft 365) e o site nao dependem do DNSSEC e seguem funcionando, pois recriamos todos os registros no Azure antes. Pode haver uma janela curta (ate ~1h) em que alguns provedores que validam DNSSEC apresentem falha temporaria, por isso fazemos em horario de baixo trafego.</w:t>
       </w:r>
     </w:p>
     <w:p>
@@ -2210,7 +2351,7 @@
           <w:b/>
           <w:color w:val="003366"/>
         </w:rPr>
-        <w:t>P: Por que precisamos desligar o DNSSEC? Nao fica menos seguro?</w:t>
+        <w:t>P: Por que precisamos remover o DNSSEC?</w:t>
       </w:r>
     </w:p>
     <w:p>
@@ -2218,7 +2359,7 @@
         <w:spacing w:after="160"/>
       </w:pPr>
       <w:r>
-        <w:t>R: E uma medida temporaria durante a migracao. Como a assinatura e feita pelas chaves do Registro.br e vamos passar o DNS para o Azure (que tera chaves proprias), manter o DS antigo quebraria a validacao. Reativamos o DNSSEC no Azure no final, restabelecendo a protecao.</w:t>
+        <w:t>R: Porque a assinatura atual e feita pelas chaves do Registro.br. Ao mover o DNS para o Azure (que tera chaves proprias), manter o DS antigo quebraria a validacao. Reativamos o DNSSEC no Azure no final.</w:t>
       </w:r>
     </w:p>
     <w:p>
@@ -2235,7 +2376,7 @@
         <w:spacing w:after="160"/>
       </w:pPr>
       <w:r>
-        <w:t>R: A acao no painel e imediata. A propagacao do DS leva de 2 a 6 horas. A migracao completa (com a troca de NS depois) pode levar ate 24-48h para propagar globalmente.</w:t>
+        <w:t>R: A troca de NS propaga em 2 a 48h. A remocao do DS segue o TTL (ate ~1h). Planejamos a janela com o cliente.</w:t>
       </w:r>
     </w:p>
     <w:p>
@@ -2244,7 +2385,7 @@
           <w:b/>
           <w:color w:val="003366"/>
         </w:rPr>
-        <w:t>P: Qual e o risco?</w:t>
+        <w:t>P: Qual e o risco e como mitigamos?</w:t>
       </w:r>
     </w:p>
     <w:p>
@@ -2252,24 +2393,7 @@
         <w:spacing w:after="160"/>
       </w:pPr>
       <w:r>
-        <w:t>R: O unico risco real e inverter a ordem (trocar os NS para o Azure antes de remover o DS). No nosso cenario, como o Registro.br gerencia tudo, ele ja faz na ordem certa ao desligar o toggle.</w:t>
-      </w:r>
-    </w:p>
-    <w:p>
-      <w:r>
-        <w:rPr>
-          <w:b/>
-          <w:color w:val="003366"/>
-        </w:rPr>
-        <w:t>P: Da para migrar mantendo o DNSSEC ligado?</w:t>
-      </w:r>
-    </w:p>
-    <w:p>
-      <w:pPr>
-        <w:spacing w:after="160"/>
-      </w:pPr>
-      <w:r>
-        <w:t>R: Tecnicamente existe um processo avancado de transferencia de chaves, mas e complexo e arriscado entre provedores diferentes. O caminho seguro e recomendado e: desligar, migrar, reativar no Azure.</w:t>
+        <w:t>R: O risco principal e o DS antigo persistir apos a troca (SERVFAIL). Mitigamos validando o DS logo apos a troca e, se necessario, acionando o Registro.br para remove-lo ou revertendo os NS temporariamente.</w:t>
       </w:r>
     </w:p>
     <w:p>
@@ -2286,7 +2410,7 @@
         <w:spacing w:after="160"/>
       </w:pPr>
       <w:r>
-        <w:t>R: Sim. Enquanto os NS ainda apontarem para o Registro.br, da para reativar o DNSSEC no proprio painel. Apos migrar para o Azure, a reativacao e feita la e o novo DS e cadastrado no Registro.br.</w:t>
+        <w:t>R: Sim. Da para reverter os nameservers para sec.dns.br enquanto investigamos. Apos a migracao, a gestao do DNSSEC passa a ser feita no Azure, com novo DS cadastrado no Registro.br.</w:t>
       </w:r>
     </w:p>
     <w:p>
@@ -2315,6 +2439,22 @@
         <w:pStyle w:val="ListBullet"/>
       </w:pPr>
       <w:r>
+        <w:t>[  ] Entendido que NAO ha toggle de DNSSEC (DNS hospedado) - sai junto com a troca de NS</w:t>
+      </w:r>
+    </w:p>
+    <w:p>
+      <w:pPr>
+        <w:pStyle w:val="ListBullet"/>
+      </w:pPr>
+      <w:r>
+        <w:t>[  ] Zona Azure DNS criada e com TODOS os registros validados ANTES da troca de NS</w:t>
+      </w:r>
+    </w:p>
+    <w:p>
+      <w:pPr>
+        <w:pStyle w:val="ListBullet"/>
+      </w:pPr>
+      <w:r>
         <w:t>[  ] Provedor de Servicos = Nenhum (senao, desbloquear antes)</w:t>
       </w:r>
     </w:p>
@@ -2323,7 +2463,7 @@
         <w:pStyle w:val="ListBullet"/>
       </w:pPr>
       <w:r>
-        <w:t>[  ] Janela de baixo trafego combinada com o cliente</w:t>
+        <w:t>[  ] Janela de baixo trafego combinada com o cliente (risco de ~1h de SERVFAIL)</w:t>
       </w:r>
     </w:p>
     <w:p>
@@ -2331,7 +2471,7 @@
         <w:pStyle w:val="ListBullet"/>
       </w:pPr>
       <w:r>
-        <w:t>[  ] Print/anotacao do estado atual do DNSSEC (Key Tag 9221, Algoritmo 13)</w:t>
+        <w:t>[  ] Comandos de validacao do DS prontos (Resolve-DnsName ... -Type DS)</w:t>
       </w:r>
     </w:p>
     <w:p>
@@ -2339,7 +2479,7 @@
         <w:pStyle w:val="ListBullet"/>
       </w:pPr>
       <w:r>
-        <w:t>[  ] Comandos de validacao prontos</w:t>
+        <w:t>[  ] Plano de contingencia: chamado Registro.br para remover DS ou reverter NS</w:t>
       </w:r>
     </w:p>
     <w:p>
@@ -2347,15 +2487,7 @@
         <w:pStyle w:val="ListBullet"/>
       </w:pPr>
       <w:r>
-        <w:t>[  ] Zona ja criada no Azure DNS com todos os registros (antes da troca de NS)</w:t>
-      </w:r>
-    </w:p>
-    <w:p>
-      <w:pPr>
-        <w:pStyle w:val="ListBullet"/>
-      </w:pPr>
-      <w:r>
-        <w:t>[  ] Combinado com o cliente o tempo de espera (2-6h) antes da troca de NS</w:t>
+        <w:t>[  ] Combinado o momento da Fase 4 (reativar DNSSEC no Azure) apos estabilizar</w:t>
       </w:r>
     </w:p>
     <w:sectPr>

</xml_diff>